<commit_message>
final report changes to the proposal
</commit_message>
<xml_diff>
--- a/ReportsAndDocuments/ManeeshaE_FinalReport.docx
+++ b/ReportsAndDocuments/ManeeshaE_FinalReport.docx
@@ -341,7 +341,7 @@
           <w:lang w:eastAsia="en-CA"/>
           <w14:ligatures w14:val="none"/>
         </w:rPr>
-        <w:t xml:space="preserve">Research in agricultural supply chain management emphasizes the importance of demand forecasting, inventory visibility, delivery coordination, and communication efficiency. Existing systems such as </w:t>
+        <w:t xml:space="preserve">Research in agricultural supply chain management emphasizes the importance of demand forecasting, inventory visibility, delivery coordination, and communication efficiency. Existing systems such as AgriWebb, FarmLogs, </w:t>
       </w:r>
       <w:proofErr w:type="spellStart"/>
       <w:r>
@@ -351,7 +351,7 @@
           <w:lang w:eastAsia="en-CA"/>
           <w14:ligatures w14:val="none"/>
         </w:rPr>
-        <w:t>AgriWebb</w:t>
+        <w:t>CropIn</w:t>
       </w:r>
       <w:proofErr w:type="spellEnd"/>
       <w:r>
@@ -361,67 +361,7 @@
           <w:lang w:eastAsia="en-CA"/>
           <w14:ligatures w14:val="none"/>
         </w:rPr>
-        <w:t xml:space="preserve">, </w:t>
-      </w:r>
-      <w:proofErr w:type="spellStart"/>
-      <w:r>
-        <w:rPr>
-          <w:rFonts w:eastAsia="Times New Roman" w:cs="Times New Roman"/>
-          <w:kern w:val="0"/>
-          <w:lang w:eastAsia="en-CA"/>
-          <w14:ligatures w14:val="none"/>
-        </w:rPr>
-        <w:t>FarmLogs</w:t>
-      </w:r>
-      <w:proofErr w:type="spellEnd"/>
-      <w:r>
-        <w:rPr>
-          <w:rFonts w:eastAsia="Times New Roman" w:cs="Times New Roman"/>
-          <w:kern w:val="0"/>
-          <w:lang w:eastAsia="en-CA"/>
-          <w14:ligatures w14:val="none"/>
-        </w:rPr>
-        <w:t xml:space="preserve">, </w:t>
-      </w:r>
-      <w:proofErr w:type="spellStart"/>
-      <w:r>
-        <w:rPr>
-          <w:rFonts w:eastAsia="Times New Roman" w:cs="Times New Roman"/>
-          <w:kern w:val="0"/>
-          <w:lang w:eastAsia="en-CA"/>
-          <w14:ligatures w14:val="none"/>
-        </w:rPr>
-        <w:t>CropIn</w:t>
-      </w:r>
-      <w:proofErr w:type="spellEnd"/>
-      <w:r>
-        <w:rPr>
-          <w:rFonts w:eastAsia="Times New Roman" w:cs="Times New Roman"/>
-          <w:kern w:val="0"/>
-          <w:lang w:eastAsia="en-CA"/>
-          <w14:ligatures w14:val="none"/>
-        </w:rPr>
-        <w:t xml:space="preserve">, and </w:t>
-      </w:r>
-      <w:proofErr w:type="spellStart"/>
-      <w:r>
-        <w:rPr>
-          <w:rFonts w:eastAsia="Times New Roman" w:cs="Times New Roman"/>
-          <w:kern w:val="0"/>
-          <w:lang w:eastAsia="en-CA"/>
-          <w14:ligatures w14:val="none"/>
-        </w:rPr>
-        <w:t>AgriDigital</w:t>
-      </w:r>
-      <w:proofErr w:type="spellEnd"/>
-      <w:r>
-        <w:rPr>
-          <w:rFonts w:eastAsia="Times New Roman" w:cs="Times New Roman"/>
-          <w:kern w:val="0"/>
-          <w:lang w:eastAsia="en-CA"/>
-          <w14:ligatures w14:val="none"/>
-        </w:rPr>
-        <w:t xml:space="preserve"> each support some aspects of agriculture operations, but several limitations remain:</w:t>
+        <w:t>, and AgriDigital each support some aspects of agriculture operations, but several limitations remain:</w:t>
       </w:r>
     </w:p>
     <w:p>
@@ -825,6 +765,3202 @@
         <w:t>better farmer decision support</w:t>
       </w:r>
     </w:p>
+    <w:p>
+      <w:pPr>
+        <w:spacing w:before="100" w:beforeAutospacing="1" w:after="100" w:afterAutospacing="1" w:line="240" w:lineRule="auto"/>
+        <w:rPr>
+          <w:rFonts w:eastAsia="Times New Roman" w:cs="Times New Roman"/>
+          <w:kern w:val="0"/>
+          <w:lang w:eastAsia="en-CA"/>
+          <w14:ligatures w14:val="none"/>
+        </w:rPr>
+      </w:pPr>
+    </w:p>
+    <w:p>
+      <w:pPr>
+        <w:spacing w:before="100" w:beforeAutospacing="1" w:after="100" w:afterAutospacing="1" w:line="240" w:lineRule="auto"/>
+        <w:rPr>
+          <w:rFonts w:eastAsia="Times New Roman" w:cs="Times New Roman"/>
+          <w:kern w:val="0"/>
+          <w:lang w:eastAsia="en-CA"/>
+          <w14:ligatures w14:val="none"/>
+        </w:rPr>
+      </w:pPr>
+    </w:p>
+    <w:p>
+      <w:pPr>
+        <w:pStyle w:val="Heading1"/>
+        <w:numPr>
+          <w:ilvl w:val="0"/>
+          <w:numId w:val="6"/>
+        </w:numPr>
+        <w:tabs>
+          <w:tab w:val="num" w:pos="720"/>
+        </w:tabs>
+      </w:pPr>
+      <w:bookmarkStart w:id="0" w:name="_Toc222767189"/>
+      <w:r>
+        <w:lastRenderedPageBreak/>
+        <w:t>Introduction</w:t>
+      </w:r>
+      <w:bookmarkEnd w:id="0"/>
+    </w:p>
+    <w:p>
+      <w:pPr>
+        <w:pStyle w:val="Heading2"/>
+        <w:numPr>
+          <w:ilvl w:val="1"/>
+          <w:numId w:val="6"/>
+        </w:numPr>
+        <w:tabs>
+          <w:tab w:val="num" w:pos="1440"/>
+        </w:tabs>
+        <w:ind w:left="1440" w:hanging="360"/>
+      </w:pPr>
+      <w:bookmarkStart w:id="1" w:name="_Toc222767190"/>
+      <w:r>
+        <w:t>Background and Domain Context</w:t>
+      </w:r>
+      <w:bookmarkEnd w:id="1"/>
+    </w:p>
+    <w:p>
+      <w:pPr>
+        <w:ind w:left="720"/>
+      </w:pPr>
+    </w:p>
+    <w:p>
+      <w:r>
+        <w:t>Local and small-scale agricultural supply chains continue to struggle with challenges such as demand uncertainty, inventory mismatch, food waste,</w:t>
+      </w:r>
+      <w:r>
+        <w:t xml:space="preserve"> </w:t>
+      </w:r>
+      <w:r>
+        <w:t>overproduction, under-supply</w:t>
+      </w:r>
+      <w:r>
+        <w:t>,</w:t>
+      </w:r>
+      <w:r>
+        <w:t xml:space="preserve"> communication gap between producer and vendor. These challenges are basically visible in British Columbia as many farmers and buyers still depend on informal communication like phone calls, text messages or word of mouth to coordinate with their business partners.</w:t>
+      </w:r>
+      <w:r>
+        <w:t xml:space="preserve"> </w:t>
+      </w:r>
+      <w:r>
+        <w:t xml:space="preserve">This lack of communication may result in </w:t>
+      </w:r>
+      <w:r>
+        <w:t>delays, inefficient dispatch planning, and poor visibility of demand and supply status</w:t>
+      </w:r>
+      <w:r>
+        <w:t>.</w:t>
+      </w:r>
+    </w:p>
+    <w:p>
+      <w:r>
+        <w:t xml:space="preserve">With increasing interest in digital transformation, there is a clear opportunity to develop a lightweight web-based platform that supports farmers and vendors through structured workflows, shared information, and decision-support features. Many currently available systems are either too enterprise-focused, too expensive, or not designed for the needs of small and medium-scale agricultural stakeholders. This project addresses that gap by designing and implementing </w:t>
+      </w:r>
+      <w:proofErr w:type="spellStart"/>
+      <w:r>
+        <w:t>FarmVendor</w:t>
+      </w:r>
+      <w:proofErr w:type="spellEnd"/>
+      <w:r>
+        <w:t>, a role-based digital platform that supports farmer–vendor coordination, demand forecasting, vendor recommendation, and real-time messaging.</w:t>
+      </w:r>
+    </w:p>
+    <w:p>
+      <w:pPr>
+        <w:ind w:left="720"/>
+      </w:pPr>
+    </w:p>
+    <w:p>
+      <w:pPr>
+        <w:pStyle w:val="Heading2"/>
+        <w:numPr>
+          <w:ilvl w:val="1"/>
+          <w:numId w:val="6"/>
+        </w:numPr>
+        <w:tabs>
+          <w:tab w:val="num" w:pos="1440"/>
+        </w:tabs>
+        <w:ind w:left="1440" w:hanging="360"/>
+      </w:pPr>
+      <w:bookmarkStart w:id="2" w:name="_Toc222767191"/>
+      <w:r>
+        <w:t>Problem Definition</w:t>
+      </w:r>
+      <w:bookmarkEnd w:id="2"/>
+    </w:p>
+    <w:p>
+      <w:r>
+        <w:t>This research addresses the lack of a structured, secure, and intelligent coordination platform for small agricultural stakeholders. The problem includes the following limitations:</w:t>
+      </w:r>
+    </w:p>
+    <w:p>
+      <w:pPr>
+        <w:numPr>
+          <w:ilvl w:val="0"/>
+          <w:numId w:val="1"/>
+        </w:numPr>
+      </w:pPr>
+      <w:r>
+        <w:t xml:space="preserve">farmers do not have a clear way to view vendor demand in one place </w:t>
+      </w:r>
+    </w:p>
+    <w:p>
+      <w:pPr>
+        <w:numPr>
+          <w:ilvl w:val="0"/>
+          <w:numId w:val="1"/>
+        </w:numPr>
+      </w:pPr>
+      <w:r>
+        <w:t xml:space="preserve">vendors do not have a structured method to submit requests and track deliveries </w:t>
+      </w:r>
+    </w:p>
+    <w:p>
+      <w:pPr>
+        <w:numPr>
+          <w:ilvl w:val="0"/>
+          <w:numId w:val="1"/>
+        </w:numPr>
+      </w:pPr>
+      <w:r>
+        <w:t xml:space="preserve">dispatch planning is not supported by demand forecasting </w:t>
+      </w:r>
+    </w:p>
+    <w:p>
+      <w:pPr>
+        <w:numPr>
+          <w:ilvl w:val="0"/>
+          <w:numId w:val="1"/>
+        </w:numPr>
+      </w:pPr>
+      <w:r>
+        <w:t xml:space="preserve">decision-making for farmers lacks data-driven vendor recommendations </w:t>
+      </w:r>
+    </w:p>
+    <w:p>
+      <w:pPr>
+        <w:numPr>
+          <w:ilvl w:val="0"/>
+          <w:numId w:val="1"/>
+        </w:numPr>
+      </w:pPr>
+      <w:r>
+        <w:t>communication between farmers and vendors is often informal and fragmented</w:t>
+      </w:r>
+    </w:p>
+    <w:p/>
+    <w:p>
+      <w:pPr>
+        <w:pStyle w:val="Heading2"/>
+        <w:numPr>
+          <w:ilvl w:val="1"/>
+          <w:numId w:val="6"/>
+        </w:numPr>
+        <w:tabs>
+          <w:tab w:val="num" w:pos="1440"/>
+        </w:tabs>
+        <w:ind w:left="1440" w:hanging="360"/>
+      </w:pPr>
+      <w:bookmarkStart w:id="3" w:name="_Toc222767192"/>
+      <w:r>
+        <w:lastRenderedPageBreak/>
+        <w:t>Research Questions</w:t>
+      </w:r>
+      <w:bookmarkEnd w:id="3"/>
+    </w:p>
+    <w:p>
+      <w:pPr>
+        <w:ind w:left="360"/>
+      </w:pPr>
+      <w:r>
+        <w:t>Following research questions are supposed to addressed by the project:</w:t>
+      </w:r>
+    </w:p>
+    <w:p>
+      <w:pPr>
+        <w:numPr>
+          <w:ilvl w:val="0"/>
+          <w:numId w:val="12"/>
+        </w:numPr>
+        <w:spacing w:before="100" w:beforeAutospacing="1" w:after="100" w:afterAutospacing="1" w:line="240" w:lineRule="auto"/>
+        <w:rPr>
+          <w:rFonts w:eastAsia="Times New Roman" w:cs="Times New Roman"/>
+          <w:kern w:val="0"/>
+          <w:lang w:eastAsia="en-CA"/>
+          <w14:ligatures w14:val="none"/>
+        </w:rPr>
+      </w:pPr>
+      <w:r>
+        <w:rPr>
+          <w:rFonts w:eastAsia="Times New Roman" w:cs="Times New Roman"/>
+          <w:kern w:val="0"/>
+          <w:lang w:eastAsia="en-CA"/>
+          <w14:ligatures w14:val="none"/>
+        </w:rPr>
+        <w:t xml:space="preserve">How can a role-based digital platform improve coordination between farmers and vendors? </w:t>
+      </w:r>
+    </w:p>
+    <w:p>
+      <w:pPr>
+        <w:numPr>
+          <w:ilvl w:val="0"/>
+          <w:numId w:val="12"/>
+        </w:numPr>
+        <w:spacing w:before="100" w:beforeAutospacing="1" w:after="100" w:afterAutospacing="1" w:line="240" w:lineRule="auto"/>
+        <w:rPr>
+          <w:rFonts w:eastAsia="Times New Roman" w:cs="Times New Roman"/>
+          <w:kern w:val="0"/>
+          <w:lang w:eastAsia="en-CA"/>
+          <w14:ligatures w14:val="none"/>
+        </w:rPr>
+      </w:pPr>
+      <w:r>
+        <w:rPr>
+          <w:rFonts w:eastAsia="Times New Roman" w:cs="Times New Roman"/>
+          <w:kern w:val="0"/>
+          <w:lang w:eastAsia="en-CA"/>
+          <w14:ligatures w14:val="none"/>
+        </w:rPr>
+        <w:t xml:space="preserve">How can simulated and user-generated data support early-stage demand forecasting? </w:t>
+      </w:r>
+    </w:p>
+    <w:p>
+      <w:pPr>
+        <w:numPr>
+          <w:ilvl w:val="0"/>
+          <w:numId w:val="12"/>
+        </w:numPr>
+        <w:spacing w:before="100" w:beforeAutospacing="1" w:after="100" w:afterAutospacing="1" w:line="240" w:lineRule="auto"/>
+        <w:rPr>
+          <w:rFonts w:eastAsia="Times New Roman" w:cs="Times New Roman"/>
+          <w:kern w:val="0"/>
+          <w:lang w:eastAsia="en-CA"/>
+          <w14:ligatures w14:val="none"/>
+        </w:rPr>
+      </w:pPr>
+      <w:r>
+        <w:rPr>
+          <w:rFonts w:eastAsia="Times New Roman" w:cs="Times New Roman"/>
+          <w:kern w:val="0"/>
+          <w:lang w:eastAsia="en-CA"/>
+          <w14:ligatures w14:val="none"/>
+        </w:rPr>
+        <w:t xml:space="preserve">How can machine-learning-based forecasting improve dispatch planning? </w:t>
+      </w:r>
+    </w:p>
+    <w:p>
+      <w:pPr>
+        <w:numPr>
+          <w:ilvl w:val="0"/>
+          <w:numId w:val="12"/>
+        </w:numPr>
+        <w:spacing w:before="100" w:beforeAutospacing="1" w:after="100" w:afterAutospacing="1" w:line="240" w:lineRule="auto"/>
+        <w:rPr>
+          <w:rFonts w:eastAsia="Times New Roman" w:cs="Times New Roman"/>
+          <w:kern w:val="0"/>
+          <w:lang w:eastAsia="en-CA"/>
+          <w14:ligatures w14:val="none"/>
+        </w:rPr>
+      </w:pPr>
+      <w:r>
+        <w:rPr>
+          <w:rFonts w:eastAsia="Times New Roman" w:cs="Times New Roman"/>
+          <w:kern w:val="0"/>
+          <w:lang w:eastAsia="en-CA"/>
+          <w14:ligatures w14:val="none"/>
+        </w:rPr>
+        <w:t xml:space="preserve">How can farmers be supported with vendor recommendations based on predicted demand and available inventory? </w:t>
+      </w:r>
+    </w:p>
+    <w:p>
+      <w:pPr>
+        <w:numPr>
+          <w:ilvl w:val="0"/>
+          <w:numId w:val="12"/>
+        </w:numPr>
+        <w:spacing w:before="100" w:beforeAutospacing="1" w:after="100" w:afterAutospacing="1" w:line="240" w:lineRule="auto"/>
+        <w:rPr>
+          <w:rFonts w:eastAsia="Times New Roman" w:cs="Times New Roman"/>
+          <w:kern w:val="0"/>
+          <w:lang w:eastAsia="en-CA"/>
+          <w14:ligatures w14:val="none"/>
+        </w:rPr>
+      </w:pPr>
+      <w:r>
+        <w:rPr>
+          <w:rFonts w:eastAsia="Times New Roman" w:cs="Times New Roman"/>
+          <w:kern w:val="0"/>
+          <w:lang w:eastAsia="en-CA"/>
+          <w14:ligatures w14:val="none"/>
+        </w:rPr>
+        <w:t xml:space="preserve">Can a real-time chat feature improve coordination and usability within the supply chain workflow? </w:t>
+      </w:r>
+    </w:p>
+    <w:p>
+      <w:pPr>
+        <w:pStyle w:val="ListParagraph"/>
+        <w:ind w:left="1440"/>
+      </w:pPr>
+    </w:p>
+    <w:p>
+      <w:pPr>
+        <w:pStyle w:val="Heading2"/>
+        <w:numPr>
+          <w:ilvl w:val="1"/>
+          <w:numId w:val="6"/>
+        </w:numPr>
+        <w:tabs>
+          <w:tab w:val="num" w:pos="1440"/>
+        </w:tabs>
+        <w:ind w:left="1440" w:hanging="360"/>
+      </w:pPr>
+      <w:bookmarkStart w:id="4" w:name="_Toc222767193"/>
+      <w:r>
+        <w:t>Literature Overview and Research Gap</w:t>
+      </w:r>
+      <w:bookmarkEnd w:id="4"/>
+    </w:p>
+    <w:p>
+      <w:pPr>
+        <w:ind w:left="360"/>
+      </w:pPr>
+    </w:p>
+    <w:p>
+      <w:pPr>
+        <w:pStyle w:val="Subtitle"/>
+        <w:ind w:firstLine="360"/>
+        <w:rPr>
+          <w:b/>
+          <w:bCs/>
+          <w:color w:val="auto"/>
+        </w:rPr>
+      </w:pPr>
+      <w:r>
+        <w:rPr>
+          <w:b/>
+          <w:bCs/>
+          <w:color w:val="auto"/>
+        </w:rPr>
+        <w:t>Literature Overview</w:t>
+      </w:r>
+    </w:p>
+    <w:p>
+      <w:pPr>
+        <w:ind w:left="360"/>
+      </w:pPr>
+      <w:r>
+        <w:t xml:space="preserve">Research in agriculture supply chain management highlights the importance of demand forecasting, inventory visibility, and coordination between farmers and vendors. Prior studies show that even basic forecasting techniques prioritised with time and structured communication should reduce food waste, improve supply planning and increase efficiency in agricultural operations. Digital platforms are increasingly used to support these goals by enabling data sharing, record keeping and making decisions on data. </w:t>
+      </w:r>
+    </w:p>
+    <w:p>
+      <w:pPr>
+        <w:ind w:left="360"/>
+      </w:pPr>
+      <w:r>
+        <w:t>There are several farm management tools and other platforms that partially support those challenges. Here is background research and limitations on existing applications.</w:t>
+      </w:r>
+    </w:p>
+    <w:p>
+      <w:pPr>
+        <w:pStyle w:val="ListParagraph"/>
+        <w:numPr>
+          <w:ilvl w:val="0"/>
+          <w:numId w:val="9"/>
+        </w:numPr>
+      </w:pPr>
+      <w:r>
+        <w:rPr>
+          <w:b/>
+          <w:bCs/>
+        </w:rPr>
+        <w:t>AgriWebb</w:t>
+      </w:r>
+      <w:r>
+        <w:t>:</w:t>
+      </w:r>
+      <w:r>
+        <w:t xml:space="preserve"> Farm management mobile application that focus on helping farmers manage production records, operational planning and inventory. offer limited direct coordination with vendors such as grocery stores and restaurants</w:t>
+      </w:r>
+    </w:p>
+    <w:p>
+      <w:pPr>
+        <w:pStyle w:val="ListParagraph"/>
+        <w:numPr>
+          <w:ilvl w:val="0"/>
+          <w:numId w:val="9"/>
+        </w:numPr>
+      </w:pPr>
+      <w:r>
+        <w:rPr>
+          <w:b/>
+          <w:bCs/>
+        </w:rPr>
+        <w:t>FarmLogs</w:t>
+      </w:r>
+      <w:r>
+        <w:t>:</w:t>
+      </w:r>
+      <w:r>
+        <w:t xml:space="preserve"> largely farmer-centric mobile application with good internal visibility. limited vendor supportive.</w:t>
+      </w:r>
+    </w:p>
+    <w:p>
+      <w:pPr>
+        <w:pStyle w:val="ListParagraph"/>
+        <w:numPr>
+          <w:ilvl w:val="0"/>
+          <w:numId w:val="9"/>
+        </w:numPr>
+      </w:pPr>
+      <w:r>
+        <w:rPr>
+          <w:b/>
+          <w:bCs/>
+        </w:rPr>
+        <w:t>Cropln</w:t>
+      </w:r>
+      <w:r>
+        <w:t>:</w:t>
+      </w:r>
+      <w:r>
+        <w:t xml:space="preserve"> web based Agri-intelligence and AI driven platform for enterprises across the agriculture value chain. Designed only for enterprise level Agri businesses</w:t>
+      </w:r>
+    </w:p>
+    <w:p>
+      <w:pPr>
+        <w:pStyle w:val="ListParagraph"/>
+        <w:numPr>
+          <w:ilvl w:val="0"/>
+          <w:numId w:val="9"/>
+        </w:numPr>
+      </w:pPr>
+      <w:r>
+        <w:rPr>
+          <w:b/>
+          <w:bCs/>
+        </w:rPr>
+        <w:t>AgriDigital</w:t>
+      </w:r>
+      <w:r>
+        <w:t>:</w:t>
+      </w:r>
+      <w:r>
+        <w:t xml:space="preserve"> Provide </w:t>
+      </w:r>
+      <w:r>
+        <w:t>cloud-based</w:t>
+      </w:r>
+      <w:r>
+        <w:t xml:space="preserve"> grain supply chain and management platform. Use blockchain technology to secure settlement while digitize grain storage, </w:t>
+      </w:r>
+      <w:r>
+        <w:lastRenderedPageBreak/>
+        <w:t>trading, logistics and financing. Less suitable for small and medium scale farmers where developed models need extensive historical data and long-term adoption.</w:t>
+      </w:r>
+    </w:p>
+    <w:p>
+      <w:pPr>
+        <w:pStyle w:val="ListParagraph"/>
+        <w:ind w:left="1080"/>
+        <w:rPr>
+          <w:b/>
+          <w:bCs/>
+        </w:rPr>
+      </w:pPr>
+    </w:p>
+    <w:p>
+      <w:pPr>
+        <w:pStyle w:val="ListParagraph"/>
+        <w:ind w:left="0"/>
+      </w:pPr>
+      <w:r>
+        <w:t>A key limitation across both academic literature and existing mobile applications and platforms is the high dependability on large historic datasets. While many optimization and forecasting models assume the availability of long-term, real world transactional data newly deployed systems and small – scale agricultural networks face a cold-start problem, where little or no historical data exists.</w:t>
+      </w:r>
+    </w:p>
+    <w:p>
+      <w:pPr>
+        <w:pStyle w:val="ListParagraph"/>
+        <w:ind w:left="0"/>
+      </w:pPr>
+    </w:p>
+    <w:p>
+      <w:pPr>
+        <w:pStyle w:val="ListParagraph"/>
+        <w:ind w:left="0"/>
+      </w:pPr>
+      <w:r>
+        <w:t>Most of systems ignore human decision making while fully automated recommendations prioritized where agriculture grow with trust, long-term relationships and farmer experience is vital in decision making and planning.</w:t>
+      </w:r>
+    </w:p>
+    <w:p>
+      <w:pPr>
+        <w:pStyle w:val="ListParagraph"/>
+      </w:pPr>
+    </w:p>
+    <w:p>
+      <w:pPr>
+        <w:pStyle w:val="ListParagraph"/>
+      </w:pPr>
+    </w:p>
+    <w:p>
+      <w:pPr>
+        <w:pStyle w:val="Subtitle"/>
+        <w:rPr>
+          <w:b/>
+          <w:bCs/>
+        </w:rPr>
+      </w:pPr>
+      <w:r>
+        <w:rPr>
+          <w:b/>
+          <w:bCs/>
+          <w:color w:val="auto"/>
+        </w:rPr>
+        <w:t>Research Gap</w:t>
+      </w:r>
+    </w:p>
+    <w:p>
+      <w:r>
+        <w:t>Below gap remains based on existing research and platforms,</w:t>
+      </w:r>
+    </w:p>
+    <w:p>
+      <w:pPr>
+        <w:pStyle w:val="ListParagraph"/>
+        <w:numPr>
+          <w:ilvl w:val="0"/>
+          <w:numId w:val="10"/>
+        </w:numPr>
+      </w:pPr>
+      <w:r>
+        <w:t>Limited availability of lightweight, role-based platforms designed specifically for local farmers and vendors.</w:t>
+      </w:r>
+    </w:p>
+    <w:p>
+      <w:pPr>
+        <w:pStyle w:val="ListParagraph"/>
+        <w:numPr>
+          <w:ilvl w:val="0"/>
+          <w:numId w:val="10"/>
+        </w:numPr>
+      </w:pPr>
+      <w:r>
+        <w:t>Insufficient support for incremental data collection, where forecasting improves gradually over time.</w:t>
+      </w:r>
+    </w:p>
+    <w:p>
+      <w:pPr>
+        <w:pStyle w:val="ListParagraph"/>
+        <w:numPr>
+          <w:ilvl w:val="0"/>
+          <w:numId w:val="10"/>
+        </w:numPr>
+      </w:pPr>
+      <w:r>
+        <w:t>Lack of optimization models that combines distance, requested quantity and historical relationships.</w:t>
+      </w:r>
+    </w:p>
+    <w:p>
+      <w:pPr>
+        <w:pStyle w:val="ListParagraph"/>
+        <w:numPr>
+          <w:ilvl w:val="0"/>
+          <w:numId w:val="10"/>
+        </w:numPr>
+      </w:pPr>
+      <w:r>
+        <w:t>Minimal focus on human-in-the-loop decision support rather than full automation.</w:t>
+      </w:r>
+    </w:p>
+    <w:p>
+      <w:pPr>
+        <w:pStyle w:val="ListParagraph"/>
+        <w:numPr>
+          <w:ilvl w:val="0"/>
+          <w:numId w:val="10"/>
+        </w:numPr>
+      </w:pPr>
+      <w:r>
+        <w:t xml:space="preserve">Overdependence on real-world, large-scale datasets that are impractical for </w:t>
+      </w:r>
+      <w:r>
+        <w:t>early-stage</w:t>
+      </w:r>
+      <w:r>
+        <w:t xml:space="preserve"> systems.</w:t>
+      </w:r>
+    </w:p>
+    <w:p>
+      <w:pPr>
+        <w:pStyle w:val="Heading2"/>
+      </w:pPr>
+      <w:bookmarkStart w:id="5" w:name="_Toc222767194"/>
+      <w:r>
+        <w:t>1.5 Hypotheses and Expected Benefits</w:t>
+      </w:r>
+      <w:bookmarkEnd w:id="5"/>
+    </w:p>
+    <w:p/>
+    <w:p>
+      <w:pPr>
+        <w:spacing w:before="100" w:beforeAutospacing="1" w:after="100" w:afterAutospacing="1" w:line="240" w:lineRule="auto"/>
+        <w:rPr>
+          <w:rFonts w:eastAsia="Times New Roman" w:cs="Times New Roman"/>
+          <w:kern w:val="0"/>
+          <w:lang w:eastAsia="en-CA"/>
+          <w14:ligatures w14:val="none"/>
+        </w:rPr>
+      </w:pPr>
+      <w:r>
+        <w:rPr>
+          <w:rFonts w:eastAsia="Times New Roman" w:cs="Times New Roman"/>
+          <w:kern w:val="0"/>
+          <w:lang w:eastAsia="en-CA"/>
+          <w14:ligatures w14:val="none"/>
+        </w:rPr>
+        <w:t>The project is based on the following assumptions:</w:t>
+      </w:r>
+    </w:p>
+    <w:p>
+      <w:pPr>
+        <w:numPr>
+          <w:ilvl w:val="0"/>
+          <w:numId w:val="4"/>
+        </w:numPr>
+        <w:spacing w:before="100" w:beforeAutospacing="1" w:after="100" w:afterAutospacing="1" w:line="240" w:lineRule="auto"/>
+        <w:rPr>
+          <w:rFonts w:eastAsia="Times New Roman" w:cs="Times New Roman"/>
+          <w:kern w:val="0"/>
+          <w:lang w:eastAsia="en-CA"/>
+          <w14:ligatures w14:val="none"/>
+        </w:rPr>
+      </w:pPr>
+      <w:r>
+        <w:rPr>
+          <w:rFonts w:eastAsia="Times New Roman" w:cs="Times New Roman"/>
+          <w:kern w:val="0"/>
+          <w:lang w:eastAsia="en-CA"/>
+          <w14:ligatures w14:val="none"/>
+        </w:rPr>
+        <w:t xml:space="preserve">structured demand communication reduces uncertainty for farmers </w:t>
+      </w:r>
+    </w:p>
+    <w:p>
+      <w:pPr>
+        <w:numPr>
+          <w:ilvl w:val="0"/>
+          <w:numId w:val="4"/>
+        </w:numPr>
+        <w:spacing w:before="100" w:beforeAutospacing="1" w:after="100" w:afterAutospacing="1" w:line="240" w:lineRule="auto"/>
+        <w:rPr>
+          <w:rFonts w:eastAsia="Times New Roman" w:cs="Times New Roman"/>
+          <w:kern w:val="0"/>
+          <w:lang w:eastAsia="en-CA"/>
+          <w14:ligatures w14:val="none"/>
+        </w:rPr>
+      </w:pPr>
+      <w:r>
+        <w:rPr>
+          <w:rFonts w:eastAsia="Times New Roman" w:cs="Times New Roman"/>
+          <w:kern w:val="0"/>
+          <w:lang w:eastAsia="en-CA"/>
+          <w14:ligatures w14:val="none"/>
+        </w:rPr>
+        <w:t xml:space="preserve">forecasting can improve dispatch planning </w:t>
+      </w:r>
+    </w:p>
+    <w:p>
+      <w:pPr>
+        <w:numPr>
+          <w:ilvl w:val="0"/>
+          <w:numId w:val="4"/>
+        </w:numPr>
+        <w:spacing w:before="100" w:beforeAutospacing="1" w:after="100" w:afterAutospacing="1" w:line="240" w:lineRule="auto"/>
+        <w:rPr>
+          <w:rFonts w:eastAsia="Times New Roman" w:cs="Times New Roman"/>
+          <w:kern w:val="0"/>
+          <w:lang w:eastAsia="en-CA"/>
+          <w14:ligatures w14:val="none"/>
+        </w:rPr>
+      </w:pPr>
+      <w:r>
+        <w:rPr>
+          <w:rFonts w:eastAsia="Times New Roman" w:cs="Times New Roman"/>
+          <w:kern w:val="0"/>
+          <w:lang w:eastAsia="en-CA"/>
+          <w14:ligatures w14:val="none"/>
+        </w:rPr>
+        <w:t xml:space="preserve">recommendation logic can support better vendor selection </w:t>
+      </w:r>
+    </w:p>
+    <w:p>
+      <w:pPr>
+        <w:numPr>
+          <w:ilvl w:val="0"/>
+          <w:numId w:val="4"/>
+        </w:numPr>
+        <w:spacing w:before="100" w:beforeAutospacing="1" w:after="100" w:afterAutospacing="1" w:line="240" w:lineRule="auto"/>
+        <w:rPr>
+          <w:rFonts w:eastAsia="Times New Roman" w:cs="Times New Roman"/>
+          <w:kern w:val="0"/>
+          <w:lang w:eastAsia="en-CA"/>
+          <w14:ligatures w14:val="none"/>
+        </w:rPr>
+      </w:pPr>
+      <w:r>
+        <w:rPr>
+          <w:rFonts w:eastAsia="Times New Roman" w:cs="Times New Roman"/>
+          <w:kern w:val="0"/>
+          <w:lang w:eastAsia="en-CA"/>
+          <w14:ligatures w14:val="none"/>
+        </w:rPr>
+        <w:t xml:space="preserve">real-time communication can reduce coordination friction </w:t>
+      </w:r>
+    </w:p>
+    <w:p>
+      <w:pPr>
+        <w:numPr>
+          <w:ilvl w:val="0"/>
+          <w:numId w:val="4"/>
+        </w:numPr>
+        <w:spacing w:before="100" w:beforeAutospacing="1" w:after="100" w:afterAutospacing="1" w:line="240" w:lineRule="auto"/>
+        <w:rPr>
+          <w:rFonts w:eastAsia="Times New Roman" w:cs="Times New Roman"/>
+          <w:kern w:val="0"/>
+          <w:lang w:eastAsia="en-CA"/>
+          <w14:ligatures w14:val="none"/>
+        </w:rPr>
+      </w:pPr>
+      <w:r>
+        <w:rPr>
+          <w:rFonts w:eastAsia="Times New Roman" w:cs="Times New Roman"/>
+          <w:kern w:val="0"/>
+          <w:lang w:eastAsia="en-CA"/>
+          <w14:ligatures w14:val="none"/>
+        </w:rPr>
+        <w:lastRenderedPageBreak/>
+        <w:t xml:space="preserve">simulated and user-generated data can support meaningful early-stage research and evaluation </w:t>
+      </w:r>
+    </w:p>
+    <w:p>
+      <w:pPr>
+        <w:spacing w:before="100" w:beforeAutospacing="1" w:after="100" w:afterAutospacing="1" w:line="240" w:lineRule="auto"/>
+        <w:rPr>
+          <w:rFonts w:eastAsia="Times New Roman" w:cs="Times New Roman"/>
+          <w:kern w:val="0"/>
+          <w:lang w:eastAsia="en-CA"/>
+          <w14:ligatures w14:val="none"/>
+        </w:rPr>
+      </w:pPr>
+      <w:r>
+        <w:rPr>
+          <w:rFonts w:eastAsia="Times New Roman" w:cs="Times New Roman"/>
+          <w:kern w:val="0"/>
+          <w:lang w:eastAsia="en-CA"/>
+          <w14:ligatures w14:val="none"/>
+        </w:rPr>
+        <w:t>Expected benefits include:</w:t>
+      </w:r>
+    </w:p>
+    <w:p>
+      <w:pPr>
+        <w:numPr>
+          <w:ilvl w:val="0"/>
+          <w:numId w:val="5"/>
+        </w:numPr>
+        <w:spacing w:before="100" w:beforeAutospacing="1" w:after="100" w:afterAutospacing="1" w:line="240" w:lineRule="auto"/>
+        <w:rPr>
+          <w:rFonts w:eastAsia="Times New Roman" w:cs="Times New Roman"/>
+          <w:kern w:val="0"/>
+          <w:lang w:eastAsia="en-CA"/>
+          <w14:ligatures w14:val="none"/>
+        </w:rPr>
+      </w:pPr>
+      <w:r>
+        <w:rPr>
+          <w:rFonts w:eastAsia="Times New Roman" w:cs="Times New Roman"/>
+          <w:kern w:val="0"/>
+          <w:lang w:eastAsia="en-CA"/>
+          <w14:ligatures w14:val="none"/>
+        </w:rPr>
+        <w:t xml:space="preserve">better visibility of demand and supply </w:t>
+      </w:r>
+    </w:p>
+    <w:p>
+      <w:pPr>
+        <w:numPr>
+          <w:ilvl w:val="0"/>
+          <w:numId w:val="5"/>
+        </w:numPr>
+        <w:spacing w:before="100" w:beforeAutospacing="1" w:after="100" w:afterAutospacing="1" w:line="240" w:lineRule="auto"/>
+        <w:rPr>
+          <w:rFonts w:eastAsia="Times New Roman" w:cs="Times New Roman"/>
+          <w:kern w:val="0"/>
+          <w:lang w:eastAsia="en-CA"/>
+          <w14:ligatures w14:val="none"/>
+        </w:rPr>
+      </w:pPr>
+      <w:r>
+        <w:rPr>
+          <w:rFonts w:eastAsia="Times New Roman" w:cs="Times New Roman"/>
+          <w:kern w:val="0"/>
+          <w:lang w:eastAsia="en-CA"/>
+          <w14:ligatures w14:val="none"/>
+        </w:rPr>
+        <w:t xml:space="preserve">improved dispatch planning </w:t>
+      </w:r>
+    </w:p>
+    <w:p>
+      <w:pPr>
+        <w:numPr>
+          <w:ilvl w:val="0"/>
+          <w:numId w:val="5"/>
+        </w:numPr>
+        <w:spacing w:before="100" w:beforeAutospacing="1" w:after="100" w:afterAutospacing="1" w:line="240" w:lineRule="auto"/>
+        <w:rPr>
+          <w:rFonts w:eastAsia="Times New Roman" w:cs="Times New Roman"/>
+          <w:kern w:val="0"/>
+          <w:lang w:eastAsia="en-CA"/>
+          <w14:ligatures w14:val="none"/>
+        </w:rPr>
+      </w:pPr>
+      <w:r>
+        <w:rPr>
+          <w:rFonts w:eastAsia="Times New Roman" w:cs="Times New Roman"/>
+          <w:kern w:val="0"/>
+          <w:lang w:eastAsia="en-CA"/>
+          <w14:ligatures w14:val="none"/>
+        </w:rPr>
+        <w:t xml:space="preserve">reduced communication barriers </w:t>
+      </w:r>
+    </w:p>
+    <w:p>
+      <w:pPr>
+        <w:numPr>
+          <w:ilvl w:val="0"/>
+          <w:numId w:val="5"/>
+        </w:numPr>
+        <w:spacing w:before="100" w:beforeAutospacing="1" w:after="100" w:afterAutospacing="1" w:line="240" w:lineRule="auto"/>
+        <w:rPr>
+          <w:rFonts w:eastAsia="Times New Roman" w:cs="Times New Roman"/>
+          <w:kern w:val="0"/>
+          <w:lang w:eastAsia="en-CA"/>
+          <w14:ligatures w14:val="none"/>
+        </w:rPr>
+      </w:pPr>
+      <w:r>
+        <w:rPr>
+          <w:rFonts w:eastAsia="Times New Roman" w:cs="Times New Roman"/>
+          <w:kern w:val="0"/>
+          <w:lang w:eastAsia="en-CA"/>
+          <w14:ligatures w14:val="none"/>
+        </w:rPr>
+        <w:t>better farmer decision support</w:t>
+      </w:r>
+    </w:p>
+    <w:p/>
+    <w:p/>
+    <w:p>
+      <w:pPr>
+        <w:pStyle w:val="Heading1"/>
+        <w:numPr>
+          <w:ilvl w:val="0"/>
+          <w:numId w:val="6"/>
+        </w:numPr>
+        <w:tabs>
+          <w:tab w:val="num" w:pos="720"/>
+        </w:tabs>
+      </w:pPr>
+      <w:bookmarkStart w:id="6" w:name="_Toc222767195"/>
+      <w:r>
+        <w:t xml:space="preserve">Summary Of </w:t>
+      </w:r>
+      <w:r>
+        <w:t>Research</w:t>
+      </w:r>
+      <w:r>
+        <w:t xml:space="preserve"> Project</w:t>
+      </w:r>
+      <w:bookmarkEnd w:id="6"/>
+    </w:p>
+    <w:p>
+      <w:pPr>
+        <w:ind w:left="360"/>
+      </w:pPr>
+    </w:p>
+    <w:p>
+      <w:pPr>
+        <w:pStyle w:val="NormalWeb"/>
+        <w:spacing w:line="300" w:lineRule="atLeast"/>
+        <w:ind w:left="360"/>
+        <w:rPr>
+          <w:rFonts w:ascii="Segoe UI" w:hAnsi="Segoe UI" w:cs="Segoe UI"/>
+          <w:sz w:val="21"/>
+          <w:szCs w:val="21"/>
+        </w:rPr>
+      </w:pPr>
+      <w:bookmarkStart w:id="7" w:name="_Toc222767196"/>
+      <w:r>
+        <w:rPr>
+          <w:rFonts w:ascii="Segoe UI" w:hAnsi="Segoe UI" w:cs="Segoe UI"/>
+          <w:sz w:val="21"/>
+          <w:szCs w:val="21"/>
+        </w:rPr>
+        <w:t xml:space="preserve">The </w:t>
+      </w:r>
+      <w:proofErr w:type="spellStart"/>
+      <w:r>
+        <w:rPr>
+          <w:rStyle w:val="Strong"/>
+          <w:rFonts w:ascii="Segoe UI" w:eastAsiaTheme="majorEastAsia" w:hAnsi="Segoe UI" w:cs="Segoe UI"/>
+          <w:b w:val="0"/>
+          <w:bCs w:val="0"/>
+          <w:sz w:val="21"/>
+          <w:szCs w:val="21"/>
+        </w:rPr>
+        <w:t>FarmVendor</w:t>
+      </w:r>
+      <w:proofErr w:type="spellEnd"/>
+      <w:r>
+        <w:rPr>
+          <w:rStyle w:val="Strong"/>
+          <w:rFonts w:ascii="Segoe UI" w:eastAsiaTheme="majorEastAsia" w:hAnsi="Segoe UI" w:cs="Segoe UI"/>
+          <w:b w:val="0"/>
+          <w:bCs w:val="0"/>
+          <w:sz w:val="21"/>
+          <w:szCs w:val="21"/>
+        </w:rPr>
+        <w:t xml:space="preserve"> project</w:t>
+      </w:r>
+      <w:r>
+        <w:rPr>
+          <w:rFonts w:ascii="Segoe UI" w:hAnsi="Segoe UI" w:cs="Segoe UI"/>
+          <w:sz w:val="21"/>
+          <w:szCs w:val="21"/>
+        </w:rPr>
+        <w:t xml:space="preserve"> is a full</w:t>
+      </w:r>
+      <w:r>
+        <w:rPr>
+          <w:rFonts w:ascii="Segoe UI" w:hAnsi="Segoe UI" w:cs="Segoe UI"/>
+          <w:sz w:val="21"/>
+          <w:szCs w:val="21"/>
+        </w:rPr>
+        <w:noBreakHyphen/>
+        <w:t>stack, role</w:t>
+      </w:r>
+      <w:r>
+        <w:rPr>
+          <w:rFonts w:ascii="Segoe UI" w:hAnsi="Segoe UI" w:cs="Segoe UI"/>
+          <w:sz w:val="21"/>
+          <w:szCs w:val="21"/>
+        </w:rPr>
+        <w:noBreakHyphen/>
+        <w:t>based web application designed to enhance coordination between farmers and vendors by integrating demand management, forecasting, and intelligent decision support into a unified platform. The system enables farmers to manage inventory, monitor product availability, and make dispatch decisions, while vendors can submit demand requests specifying required quantities and delivery timelines.</w:t>
+      </w:r>
+    </w:p>
+    <w:p>
+      <w:pPr>
+        <w:pStyle w:val="NormalWeb"/>
+        <w:spacing w:line="300" w:lineRule="atLeast"/>
+        <w:ind w:left="360"/>
+        <w:rPr>
+          <w:rFonts w:ascii="Segoe UI" w:hAnsi="Segoe UI" w:cs="Segoe UI"/>
+          <w:sz w:val="21"/>
+          <w:szCs w:val="21"/>
+        </w:rPr>
+      </w:pPr>
+      <w:r>
+        <w:rPr>
+          <w:rFonts w:ascii="Segoe UI" w:hAnsi="Segoe UI" w:cs="Segoe UI"/>
+          <w:sz w:val="21"/>
+          <w:szCs w:val="21"/>
+        </w:rPr>
+        <w:t xml:space="preserve">A central feature of the project is the integration of </w:t>
+      </w:r>
+      <w:r>
+        <w:rPr>
+          <w:rStyle w:val="Strong"/>
+          <w:rFonts w:ascii="Segoe UI" w:eastAsiaTheme="majorEastAsia" w:hAnsi="Segoe UI" w:cs="Segoe UI"/>
+          <w:b w:val="0"/>
+          <w:bCs w:val="0"/>
+          <w:sz w:val="21"/>
+          <w:szCs w:val="21"/>
+        </w:rPr>
+        <w:t>machine learning–based demand forecasting</w:t>
+      </w:r>
+      <w:r>
+        <w:rPr>
+          <w:rFonts w:ascii="Segoe UI" w:hAnsi="Segoe UI" w:cs="Segoe UI"/>
+          <w:sz w:val="21"/>
+          <w:szCs w:val="21"/>
+        </w:rPr>
+        <w:t xml:space="preserve"> using the </w:t>
+      </w:r>
+      <w:r>
+        <w:rPr>
+          <w:rStyle w:val="Strong"/>
+          <w:rFonts w:ascii="Segoe UI" w:eastAsiaTheme="majorEastAsia" w:hAnsi="Segoe UI" w:cs="Segoe UI"/>
+          <w:b w:val="0"/>
+          <w:bCs w:val="0"/>
+          <w:sz w:val="21"/>
+          <w:szCs w:val="21"/>
+        </w:rPr>
+        <w:t>ML.NET Singular Spectrum Analysis (SSA)</w:t>
+      </w:r>
+      <w:r>
+        <w:rPr>
+          <w:rFonts w:ascii="Segoe UI" w:hAnsi="Segoe UI" w:cs="Segoe UI"/>
+          <w:sz w:val="21"/>
+          <w:szCs w:val="21"/>
+        </w:rPr>
+        <w:t xml:space="preserve"> algorithm. This forecasting component analyzes historical demand request data to generate future demand predictions for specific vendor–product combinations. These predictions support proactive planning by helping farmers anticipate demand, reduce produce waste, and optimize inventory and dispatch strategies.</w:t>
+      </w:r>
+    </w:p>
+    <w:p>
+      <w:pPr>
+        <w:pStyle w:val="NormalWeb"/>
+        <w:spacing w:line="300" w:lineRule="atLeast"/>
+        <w:ind w:left="360"/>
+        <w:rPr>
+          <w:rFonts w:ascii="Segoe UI" w:hAnsi="Segoe UI" w:cs="Segoe UI"/>
+          <w:sz w:val="21"/>
+          <w:szCs w:val="21"/>
+        </w:rPr>
+      </w:pPr>
+      <w:r>
+        <w:rPr>
+          <w:rFonts w:ascii="Segoe UI" w:hAnsi="Segoe UI" w:cs="Segoe UI"/>
+          <w:sz w:val="21"/>
+          <w:szCs w:val="21"/>
+        </w:rPr>
+        <w:t xml:space="preserve">Building on the forecasting capability, the system incorporates an </w:t>
+      </w:r>
+      <w:r>
+        <w:rPr>
+          <w:rStyle w:val="Strong"/>
+          <w:rFonts w:ascii="Segoe UI" w:eastAsiaTheme="majorEastAsia" w:hAnsi="Segoe UI" w:cs="Segoe UI"/>
+          <w:b w:val="0"/>
+          <w:bCs w:val="0"/>
+          <w:sz w:val="21"/>
+          <w:szCs w:val="21"/>
+        </w:rPr>
+        <w:t>intelligent vendor recommendation module</w:t>
+      </w:r>
+      <w:r>
+        <w:rPr>
+          <w:rFonts w:ascii="Segoe UI" w:hAnsi="Segoe UI" w:cs="Segoe UI"/>
+          <w:sz w:val="21"/>
+          <w:szCs w:val="21"/>
+        </w:rPr>
+        <w:t xml:space="preserve"> that identifies the most suitable vendors for dispatching. This module evaluates multiple factors, including forecasted demand, available farmer inventory, geographical distance between farmers and vendors, and historical relationship scores derived from past interactions. A weighted scoring mechanism is applied to rank vendors, allowing farmers to make informed, data</w:t>
+      </w:r>
+      <w:r>
+        <w:rPr>
+          <w:rFonts w:ascii="Segoe UI" w:hAnsi="Segoe UI" w:cs="Segoe UI"/>
+          <w:sz w:val="21"/>
+          <w:szCs w:val="21"/>
+        </w:rPr>
+        <w:noBreakHyphen/>
+        <w:t>driven decisions when selecting vendors for fulfillment.</w:t>
+      </w:r>
+    </w:p>
+    <w:p>
+      <w:pPr>
+        <w:pStyle w:val="NormalWeb"/>
+        <w:spacing w:line="300" w:lineRule="atLeast"/>
+        <w:ind w:left="360"/>
+        <w:rPr>
+          <w:rFonts w:ascii="Segoe UI" w:hAnsi="Segoe UI" w:cs="Segoe UI"/>
+          <w:sz w:val="21"/>
+          <w:szCs w:val="21"/>
+        </w:rPr>
+      </w:pPr>
+      <w:r>
+        <w:rPr>
+          <w:rFonts w:ascii="Segoe UI" w:hAnsi="Segoe UI" w:cs="Segoe UI"/>
+          <w:sz w:val="21"/>
+          <w:szCs w:val="21"/>
+        </w:rPr>
+        <w:t xml:space="preserve">To enhance collaboration and operational efficiency, the platform also includes a </w:t>
+      </w:r>
+      <w:r>
+        <w:rPr>
+          <w:rStyle w:val="Strong"/>
+          <w:rFonts w:ascii="Segoe UI" w:eastAsiaTheme="majorEastAsia" w:hAnsi="Segoe UI" w:cs="Segoe UI"/>
+          <w:b w:val="0"/>
+          <w:bCs w:val="0"/>
+          <w:sz w:val="21"/>
+          <w:szCs w:val="21"/>
+        </w:rPr>
+        <w:t>real</w:t>
+      </w:r>
+      <w:r>
+        <w:rPr>
+          <w:rStyle w:val="Strong"/>
+          <w:rFonts w:ascii="Segoe UI" w:eastAsiaTheme="majorEastAsia" w:hAnsi="Segoe UI" w:cs="Segoe UI"/>
+          <w:b w:val="0"/>
+          <w:bCs w:val="0"/>
+          <w:sz w:val="21"/>
+          <w:szCs w:val="21"/>
+        </w:rPr>
+        <w:noBreakHyphen/>
+        <w:t>time communication module</w:t>
+      </w:r>
+      <w:r>
+        <w:rPr>
+          <w:rFonts w:ascii="Segoe UI" w:hAnsi="Segoe UI" w:cs="Segoe UI"/>
+          <w:sz w:val="21"/>
+          <w:szCs w:val="21"/>
+        </w:rPr>
+        <w:t xml:space="preserve"> implemented using </w:t>
+      </w:r>
+      <w:proofErr w:type="spellStart"/>
+      <w:r>
+        <w:rPr>
+          <w:rStyle w:val="Strong"/>
+          <w:rFonts w:ascii="Segoe UI" w:eastAsiaTheme="majorEastAsia" w:hAnsi="Segoe UI" w:cs="Segoe UI"/>
+          <w:b w:val="0"/>
+          <w:bCs w:val="0"/>
+          <w:sz w:val="21"/>
+          <w:szCs w:val="21"/>
+        </w:rPr>
+        <w:t>SignalR</w:t>
+      </w:r>
+      <w:proofErr w:type="spellEnd"/>
+      <w:r>
+        <w:rPr>
+          <w:rFonts w:ascii="Segoe UI" w:hAnsi="Segoe UI" w:cs="Segoe UI"/>
+          <w:b/>
+          <w:bCs/>
+          <w:sz w:val="21"/>
+          <w:szCs w:val="21"/>
+        </w:rPr>
+        <w:t>,</w:t>
+      </w:r>
+      <w:r>
+        <w:rPr>
+          <w:rFonts w:ascii="Segoe UI" w:hAnsi="Segoe UI" w:cs="Segoe UI"/>
+          <w:sz w:val="21"/>
+          <w:szCs w:val="21"/>
+        </w:rPr>
+        <w:t xml:space="preserve"> enabling direct and instant messaging between farmers and vendors. This feature supports timely coordination, negotiation, and clarification during the dispatch process.</w:t>
+      </w:r>
+    </w:p>
+    <w:p>
+      <w:pPr>
+        <w:pStyle w:val="NormalWeb"/>
+        <w:spacing w:line="300" w:lineRule="atLeast"/>
+        <w:ind w:left="360"/>
+        <w:rPr>
+          <w:rFonts w:ascii="Segoe UI" w:hAnsi="Segoe UI" w:cs="Segoe UI"/>
+          <w:sz w:val="21"/>
+          <w:szCs w:val="21"/>
+        </w:rPr>
+      </w:pPr>
+      <w:r>
+        <w:rPr>
+          <w:rFonts w:ascii="Segoe UI" w:hAnsi="Segoe UI" w:cs="Segoe UI"/>
+          <w:sz w:val="21"/>
+          <w:szCs w:val="21"/>
+        </w:rPr>
+        <w:lastRenderedPageBreak/>
+        <w:t xml:space="preserve">The application is developed using a modern and scalable technology stack, with </w:t>
+      </w:r>
+      <w:r>
+        <w:rPr>
+          <w:rStyle w:val="Strong"/>
+          <w:rFonts w:ascii="Segoe UI" w:eastAsiaTheme="majorEastAsia" w:hAnsi="Segoe UI" w:cs="Segoe UI"/>
+          <w:b w:val="0"/>
+          <w:bCs w:val="0"/>
+          <w:sz w:val="21"/>
+          <w:szCs w:val="21"/>
+        </w:rPr>
+        <w:t>React (</w:t>
+      </w:r>
+      <w:proofErr w:type="spellStart"/>
+      <w:r>
+        <w:rPr>
+          <w:rStyle w:val="Strong"/>
+          <w:rFonts w:ascii="Segoe UI" w:eastAsiaTheme="majorEastAsia" w:hAnsi="Segoe UI" w:cs="Segoe UI"/>
+          <w:b w:val="0"/>
+          <w:bCs w:val="0"/>
+          <w:sz w:val="21"/>
+          <w:szCs w:val="21"/>
+        </w:rPr>
+        <w:t>Vite</w:t>
+      </w:r>
+      <w:proofErr w:type="spellEnd"/>
+      <w:r>
+        <w:rPr>
+          <w:rStyle w:val="Strong"/>
+          <w:rFonts w:ascii="Segoe UI" w:eastAsiaTheme="majorEastAsia" w:hAnsi="Segoe UI" w:cs="Segoe UI"/>
+          <w:b w:val="0"/>
+          <w:bCs w:val="0"/>
+          <w:sz w:val="21"/>
+          <w:szCs w:val="21"/>
+        </w:rPr>
+        <w:t>)</w:t>
+      </w:r>
+      <w:r>
+        <w:rPr>
+          <w:rFonts w:ascii="Segoe UI" w:hAnsi="Segoe UI" w:cs="Segoe UI"/>
+          <w:sz w:val="21"/>
+          <w:szCs w:val="21"/>
+        </w:rPr>
+        <w:t xml:space="preserve"> for the frontend</w:t>
+      </w:r>
+      <w:r>
+        <w:rPr>
+          <w:rFonts w:ascii="Segoe UI" w:hAnsi="Segoe UI" w:cs="Segoe UI"/>
+          <w:b/>
+          <w:bCs/>
+          <w:sz w:val="21"/>
+          <w:szCs w:val="21"/>
+        </w:rPr>
+        <w:t xml:space="preserve">, </w:t>
+      </w:r>
+      <w:r>
+        <w:rPr>
+          <w:rStyle w:val="Strong"/>
+          <w:rFonts w:ascii="Segoe UI" w:eastAsiaTheme="majorEastAsia" w:hAnsi="Segoe UI" w:cs="Segoe UI"/>
+          <w:b w:val="0"/>
+          <w:bCs w:val="0"/>
+          <w:sz w:val="21"/>
+          <w:szCs w:val="21"/>
+        </w:rPr>
+        <w:t>ASP.NET Core (.NET 8)</w:t>
+      </w:r>
+      <w:r>
+        <w:rPr>
+          <w:rFonts w:ascii="Segoe UI" w:hAnsi="Segoe UI" w:cs="Segoe UI"/>
+          <w:sz w:val="21"/>
+          <w:szCs w:val="21"/>
+        </w:rPr>
+        <w:t xml:space="preserve"> for backend services, and</w:t>
+      </w:r>
+      <w:r>
+        <w:rPr>
+          <w:rFonts w:ascii="Segoe UI" w:hAnsi="Segoe UI" w:cs="Segoe UI"/>
+          <w:b/>
+          <w:bCs/>
+          <w:sz w:val="21"/>
+          <w:szCs w:val="21"/>
+        </w:rPr>
+        <w:t xml:space="preserve"> </w:t>
+      </w:r>
+      <w:r>
+        <w:rPr>
+          <w:rStyle w:val="Strong"/>
+          <w:rFonts w:ascii="Segoe UI" w:eastAsiaTheme="majorEastAsia" w:hAnsi="Segoe UI" w:cs="Segoe UI"/>
+          <w:b w:val="0"/>
+          <w:bCs w:val="0"/>
+          <w:sz w:val="21"/>
+          <w:szCs w:val="21"/>
+        </w:rPr>
+        <w:t>SQL Server</w:t>
+      </w:r>
+      <w:r>
+        <w:rPr>
+          <w:rFonts w:ascii="Segoe UI" w:hAnsi="Segoe UI" w:cs="Segoe UI"/>
+          <w:sz w:val="21"/>
+          <w:szCs w:val="21"/>
+        </w:rPr>
+        <w:t xml:space="preserve"> for data persistence. The system follows a </w:t>
+      </w:r>
+      <w:r>
+        <w:rPr>
+          <w:rStyle w:val="Strong"/>
+          <w:rFonts w:ascii="Segoe UI" w:eastAsiaTheme="majorEastAsia" w:hAnsi="Segoe UI" w:cs="Segoe UI"/>
+          <w:b w:val="0"/>
+          <w:bCs w:val="0"/>
+          <w:sz w:val="21"/>
+          <w:szCs w:val="21"/>
+        </w:rPr>
+        <w:t>layered architectural approach</w:t>
+      </w:r>
+      <w:r>
+        <w:rPr>
+          <w:rFonts w:ascii="Segoe UI" w:hAnsi="Segoe UI" w:cs="Segoe UI"/>
+          <w:sz w:val="21"/>
+          <w:szCs w:val="21"/>
+        </w:rPr>
+        <w:t>, clearly separating the presentation layer, business logic, and data access components to improve modularity, maintainability, and scalability.</w:t>
+      </w:r>
+    </w:p>
+    <w:p>
+      <w:pPr>
+        <w:pStyle w:val="NormalWeb"/>
+        <w:spacing w:line="300" w:lineRule="atLeast"/>
+        <w:ind w:left="360"/>
+        <w:rPr>
+          <w:rFonts w:ascii="Segoe UI" w:hAnsi="Segoe UI" w:cs="Segoe UI"/>
+          <w:sz w:val="21"/>
+          <w:szCs w:val="21"/>
+        </w:rPr>
+      </w:pPr>
+      <w:r>
+        <w:rPr>
+          <w:rFonts w:ascii="Segoe UI" w:hAnsi="Segoe UI" w:cs="Segoe UI"/>
+          <w:sz w:val="21"/>
+          <w:szCs w:val="21"/>
+        </w:rPr>
+        <w:t xml:space="preserve">Overall, the </w:t>
+      </w:r>
+      <w:proofErr w:type="spellStart"/>
+      <w:r>
+        <w:rPr>
+          <w:rFonts w:ascii="Segoe UI" w:hAnsi="Segoe UI" w:cs="Segoe UI"/>
+          <w:sz w:val="21"/>
+          <w:szCs w:val="21"/>
+        </w:rPr>
+        <w:t>FarmVendor</w:t>
+      </w:r>
+      <w:proofErr w:type="spellEnd"/>
+      <w:r>
+        <w:rPr>
+          <w:rFonts w:ascii="Segoe UI" w:hAnsi="Segoe UI" w:cs="Segoe UI"/>
+          <w:sz w:val="21"/>
+          <w:szCs w:val="21"/>
+        </w:rPr>
+        <w:t xml:space="preserve"> project transforms a traditional transactional system into an </w:t>
+      </w:r>
+      <w:r>
+        <w:rPr>
+          <w:rStyle w:val="Strong"/>
+          <w:rFonts w:ascii="Segoe UI" w:eastAsiaTheme="majorEastAsia" w:hAnsi="Segoe UI" w:cs="Segoe UI"/>
+          <w:b w:val="0"/>
+          <w:bCs w:val="0"/>
+          <w:sz w:val="21"/>
+          <w:szCs w:val="21"/>
+        </w:rPr>
+        <w:t>intelligent, data</w:t>
+      </w:r>
+      <w:r>
+        <w:rPr>
+          <w:rStyle w:val="Strong"/>
+          <w:rFonts w:ascii="Segoe UI" w:eastAsiaTheme="majorEastAsia" w:hAnsi="Segoe UI" w:cs="Segoe UI"/>
+          <w:b w:val="0"/>
+          <w:bCs w:val="0"/>
+          <w:sz w:val="21"/>
+          <w:szCs w:val="21"/>
+        </w:rPr>
+        <w:noBreakHyphen/>
+        <w:t>driven agricultural supply chain platform</w:t>
+      </w:r>
+      <w:r>
+        <w:rPr>
+          <w:rFonts w:ascii="Segoe UI" w:hAnsi="Segoe UI" w:cs="Segoe UI"/>
+          <w:sz w:val="21"/>
+          <w:szCs w:val="21"/>
+        </w:rPr>
+        <w:t xml:space="preserve"> by integrating forecasting, recommendation algorithms, and real</w:t>
+      </w:r>
+      <w:r>
+        <w:rPr>
+          <w:rFonts w:ascii="Segoe UI" w:hAnsi="Segoe UI" w:cs="Segoe UI"/>
+          <w:sz w:val="21"/>
+          <w:szCs w:val="21"/>
+        </w:rPr>
+        <w:noBreakHyphen/>
+        <w:t>time communication. The project demonstrates how emerging technologies can be applied to improve efficiency, reduce uncertainty, and support informed decision</w:t>
+      </w:r>
+      <w:r>
+        <w:rPr>
+          <w:rFonts w:ascii="Segoe UI" w:hAnsi="Segoe UI" w:cs="Segoe UI"/>
+          <w:sz w:val="21"/>
+          <w:szCs w:val="21"/>
+        </w:rPr>
+        <w:noBreakHyphen/>
+        <w:t>making in agricultural supply chain management.</w:t>
+      </w:r>
+    </w:p>
+    <w:p>
+      <w:pPr>
+        <w:pStyle w:val="Heading1"/>
+        <w:numPr>
+          <w:ilvl w:val="0"/>
+          <w:numId w:val="6"/>
+        </w:numPr>
+        <w:tabs>
+          <w:tab w:val="num" w:pos="720"/>
+        </w:tabs>
+      </w:pPr>
+      <w:r>
+        <w:t>Changes to the Proposal</w:t>
+      </w:r>
+      <w:bookmarkEnd w:id="7"/>
+    </w:p>
+    <w:p/>
+    <w:p>
+      <w:pPr>
+        <w:ind w:left="360"/>
+      </w:pPr>
+      <w:r>
+        <w:t xml:space="preserve">During the implementation phase of the </w:t>
+      </w:r>
+      <w:proofErr w:type="spellStart"/>
+      <w:r>
+        <w:t>FarmVendor</w:t>
+      </w:r>
+      <w:proofErr w:type="spellEnd"/>
+      <w:r>
+        <w:t xml:space="preserve"> project, several modifications were introduced to enhance system functionality, usability, and alignment with real</w:t>
+      </w:r>
+      <w:r>
+        <w:noBreakHyphen/>
+        <w:t>world agricultural requirements. These changes were informed by iterative testing, technical feasibility analysis, and the need to support intelligent decision</w:t>
+      </w:r>
+      <w:r>
+        <w:noBreakHyphen/>
+        <w:t>making for non</w:t>
+      </w:r>
+      <w:r>
+        <w:noBreakHyphen/>
+        <w:t>technical users. Overall, the refinements strengthened the original proposal by improving scalability, interpretability, and practical applicability.</w:t>
+      </w:r>
+    </w:p>
+    <w:p/>
+    <w:p/>
+    <w:p>
+      <w:r>
+        <w:t xml:space="preserve">       </w:t>
+      </w:r>
+    </w:p>
+    <w:tbl>
+      <w:tblPr>
+        <w:tblW w:w="8840" w:type="dxa"/>
+        <w:tblLook w:val="04A0" w:firstRow="1" w:lastRow="0" w:firstColumn="1" w:lastColumn="0" w:noHBand="0" w:noVBand="1"/>
+      </w:tblPr>
+      <w:tblGrid>
+        <w:gridCol w:w="2045"/>
+        <w:gridCol w:w="3313"/>
+        <w:gridCol w:w="3482"/>
+      </w:tblGrid>
+      <w:tr>
+        <w:trPr>
+          <w:trHeight w:val="825"/>
+        </w:trPr>
+        <w:tc>
+          <w:tcPr>
+            <w:tcW w:w="1859" w:type="dxa"/>
+            <w:tcBorders>
+              <w:top w:val="single" w:sz="8" w:space="0" w:color="E6E6E6"/>
+              <w:left w:val="single" w:sz="8" w:space="0" w:color="E6E6E6"/>
+              <w:bottom w:val="single" w:sz="8" w:space="0" w:color="E6E6E6"/>
+              <w:right w:val="single" w:sz="8" w:space="0" w:color="E6E6E6"/>
+            </w:tcBorders>
+            <w:shd w:val="clear" w:color="000000" w:fill="F5F5F5"/>
+            <w:vAlign w:val="center"/>
+            <w:hideMark/>
+          </w:tcPr>
+          <w:p>
+            <w:pPr>
+              <w:spacing w:after="0" w:line="240" w:lineRule="auto"/>
+              <w:jc w:val="center"/>
+              <w:rPr>
+                <w:rFonts w:ascii="Segoe UI" w:eastAsia="Times New Roman" w:hAnsi="Segoe UI" w:cs="Segoe UI"/>
+                <w:b/>
+                <w:bCs/>
+                <w:color w:val="000000"/>
+                <w:kern w:val="0"/>
+                <w:sz w:val="22"/>
+                <w:szCs w:val="22"/>
+                <w:lang w:eastAsia="en-CA"/>
+                <w14:ligatures w14:val="none"/>
+              </w:rPr>
+            </w:pPr>
+            <w:r>
+              <w:rPr>
+                <w:rFonts w:ascii="Segoe UI" w:eastAsia="Times New Roman" w:hAnsi="Segoe UI" w:cs="Segoe UI"/>
+                <w:b/>
+                <w:bCs/>
+                <w:color w:val="000000"/>
+                <w:kern w:val="0"/>
+                <w:sz w:val="22"/>
+                <w:szCs w:val="22"/>
+                <w:lang w:eastAsia="en-CA"/>
+                <w14:ligatures w14:val="none"/>
+              </w:rPr>
+              <w:t>Change Area</w:t>
+            </w:r>
+          </w:p>
+        </w:tc>
+        <w:tc>
+          <w:tcPr>
+            <w:tcW w:w="3392" w:type="dxa"/>
+            <w:tcBorders>
+              <w:top w:val="single" w:sz="8" w:space="0" w:color="E6E6E6"/>
+              <w:left w:val="nil"/>
+              <w:bottom w:val="single" w:sz="8" w:space="0" w:color="E6E6E6"/>
+              <w:right w:val="single" w:sz="8" w:space="0" w:color="E6E6E6"/>
+            </w:tcBorders>
+            <w:shd w:val="clear" w:color="000000" w:fill="F5F5F5"/>
+            <w:vAlign w:val="center"/>
+            <w:hideMark/>
+          </w:tcPr>
+          <w:p>
+            <w:pPr>
+              <w:spacing w:after="0" w:line="240" w:lineRule="auto"/>
+              <w:jc w:val="center"/>
+              <w:rPr>
+                <w:rFonts w:ascii="Segoe UI" w:eastAsia="Times New Roman" w:hAnsi="Segoe UI" w:cs="Segoe UI"/>
+                <w:b/>
+                <w:bCs/>
+                <w:color w:val="000000"/>
+                <w:kern w:val="0"/>
+                <w:sz w:val="22"/>
+                <w:szCs w:val="22"/>
+                <w:lang w:eastAsia="en-CA"/>
+                <w14:ligatures w14:val="none"/>
+              </w:rPr>
+            </w:pPr>
+            <w:r>
+              <w:rPr>
+                <w:rFonts w:ascii="Segoe UI" w:eastAsia="Times New Roman" w:hAnsi="Segoe UI" w:cs="Segoe UI"/>
+                <w:b/>
+                <w:bCs/>
+                <w:color w:val="000000"/>
+                <w:kern w:val="0"/>
+                <w:sz w:val="22"/>
+                <w:szCs w:val="22"/>
+                <w:lang w:eastAsia="en-CA"/>
+                <w14:ligatures w14:val="none"/>
+              </w:rPr>
+              <w:t>Description</w:t>
+            </w:r>
+          </w:p>
+        </w:tc>
+        <w:tc>
+          <w:tcPr>
+            <w:tcW w:w="3589" w:type="dxa"/>
+            <w:tcBorders>
+              <w:top w:val="single" w:sz="8" w:space="0" w:color="E6E6E6"/>
+              <w:left w:val="nil"/>
+              <w:bottom w:val="single" w:sz="8" w:space="0" w:color="E6E6E6"/>
+              <w:right w:val="single" w:sz="8" w:space="0" w:color="E6E6E6"/>
+            </w:tcBorders>
+            <w:shd w:val="clear" w:color="000000" w:fill="F5F5F5"/>
+            <w:vAlign w:val="center"/>
+            <w:hideMark/>
+          </w:tcPr>
+          <w:p>
+            <w:pPr>
+              <w:spacing w:after="0" w:line="240" w:lineRule="auto"/>
+              <w:jc w:val="center"/>
+              <w:rPr>
+                <w:rFonts w:ascii="Segoe UI" w:eastAsia="Times New Roman" w:hAnsi="Segoe UI" w:cs="Segoe UI"/>
+                <w:b/>
+                <w:bCs/>
+                <w:color w:val="000000"/>
+                <w:kern w:val="0"/>
+                <w:sz w:val="22"/>
+                <w:szCs w:val="22"/>
+                <w:lang w:eastAsia="en-CA"/>
+                <w14:ligatures w14:val="none"/>
+              </w:rPr>
+            </w:pPr>
+            <w:r>
+              <w:rPr>
+                <w:rFonts w:ascii="Segoe UI" w:eastAsia="Times New Roman" w:hAnsi="Segoe UI" w:cs="Segoe UI"/>
+                <w:b/>
+                <w:bCs/>
+                <w:color w:val="000000"/>
+                <w:kern w:val="0"/>
+                <w:sz w:val="22"/>
+                <w:szCs w:val="22"/>
+                <w:lang w:eastAsia="en-CA"/>
+                <w14:ligatures w14:val="none"/>
+              </w:rPr>
+              <w:t>Justification</w:t>
+            </w:r>
+          </w:p>
+        </w:tc>
+      </w:tr>
+      <w:tr>
+        <w:trPr>
+          <w:trHeight w:val="2280"/>
+        </w:trPr>
+        <w:tc>
+          <w:tcPr>
+            <w:tcW w:w="1859" w:type="dxa"/>
+            <w:tcBorders>
+              <w:top w:val="nil"/>
+              <w:left w:val="single" w:sz="8" w:space="0" w:color="E6E6E6"/>
+              <w:bottom w:val="single" w:sz="8" w:space="0" w:color="E6E6E6"/>
+              <w:right w:val="single" w:sz="8" w:space="0" w:color="E6E6E6"/>
+            </w:tcBorders>
+            <w:shd w:val="clear" w:color="000000" w:fill="F5F5F5"/>
+            <w:vAlign w:val="center"/>
+            <w:hideMark/>
+          </w:tcPr>
+          <w:p>
+            <w:pPr>
+              <w:spacing w:after="0" w:line="240" w:lineRule="auto"/>
+              <w:rPr>
+                <w:rFonts w:ascii="Segoe UI" w:eastAsia="Times New Roman" w:hAnsi="Segoe UI" w:cs="Segoe UI"/>
+                <w:b/>
+                <w:bCs/>
+                <w:color w:val="000000"/>
+                <w:kern w:val="0"/>
+                <w:sz w:val="22"/>
+                <w:szCs w:val="22"/>
+                <w:lang w:eastAsia="en-CA"/>
+                <w14:ligatures w14:val="none"/>
+              </w:rPr>
+            </w:pPr>
+            <w:r>
+              <w:rPr>
+                <w:rFonts w:ascii="Segoe UI" w:eastAsia="Times New Roman" w:hAnsi="Segoe UI" w:cs="Segoe UI"/>
+                <w:b/>
+                <w:bCs/>
+                <w:color w:val="000000"/>
+                <w:kern w:val="0"/>
+                <w:sz w:val="22"/>
+                <w:szCs w:val="22"/>
+                <w:lang w:eastAsia="en-CA"/>
+                <w14:ligatures w14:val="none"/>
+              </w:rPr>
+              <w:t>Forecast Model</w:t>
+            </w:r>
+          </w:p>
+        </w:tc>
+        <w:tc>
+          <w:tcPr>
+            <w:tcW w:w="3392" w:type="dxa"/>
+            <w:tcBorders>
+              <w:top w:val="nil"/>
+              <w:left w:val="nil"/>
+              <w:bottom w:val="single" w:sz="8" w:space="0" w:color="E6E6E6"/>
+              <w:right w:val="single" w:sz="8" w:space="0" w:color="E6E6E6"/>
+            </w:tcBorders>
+            <w:shd w:val="clear" w:color="auto" w:fill="auto"/>
+            <w:vAlign w:val="center"/>
+            <w:hideMark/>
+          </w:tcPr>
+          <w:p>
+            <w:pPr>
+              <w:spacing w:after="0" w:line="240" w:lineRule="auto"/>
+              <w:rPr>
+                <w:rFonts w:ascii="Segoe UI" w:eastAsia="Times New Roman" w:hAnsi="Segoe UI" w:cs="Segoe UI"/>
+                <w:color w:val="000000"/>
+                <w:kern w:val="0"/>
+                <w:sz w:val="22"/>
+                <w:szCs w:val="22"/>
+                <w:lang w:eastAsia="en-CA"/>
+                <w14:ligatures w14:val="none"/>
+              </w:rPr>
+            </w:pPr>
+            <w:r>
+              <w:rPr>
+                <w:rFonts w:ascii="Segoe UI" w:eastAsia="Times New Roman" w:hAnsi="Segoe UI" w:cs="Segoe UI"/>
+                <w:color w:val="000000"/>
+                <w:kern w:val="0"/>
+                <w:sz w:val="22"/>
+                <w:szCs w:val="22"/>
+                <w:lang w:eastAsia="en-CA"/>
+                <w14:ligatures w14:val="none"/>
+              </w:rPr>
+              <w:t>The initially proposed simple logic</w:t>
+            </w:r>
+            <w:r>
+              <w:rPr>
+                <w:rFonts w:ascii="Segoe UI" w:eastAsia="Times New Roman" w:hAnsi="Segoe UI" w:cs="Segoe UI"/>
+                <w:color w:val="000000"/>
+                <w:kern w:val="0"/>
+                <w:sz w:val="22"/>
+                <w:szCs w:val="22"/>
+                <w:lang w:eastAsia="en-CA"/>
+                <w14:ligatures w14:val="none"/>
+              </w:rPr>
+              <w:noBreakHyphen/>
+              <w:t>based demand estimation approach and Moving Average algorithm was replaced with a machine learning</w:t>
+            </w:r>
+            <w:r>
+              <w:rPr>
+                <w:rFonts w:ascii="Segoe UI" w:eastAsia="Times New Roman" w:hAnsi="Segoe UI" w:cs="Segoe UI"/>
+                <w:color w:val="000000"/>
+                <w:kern w:val="0"/>
+                <w:sz w:val="22"/>
+                <w:szCs w:val="22"/>
+                <w:lang w:eastAsia="en-CA"/>
+                <w14:ligatures w14:val="none"/>
+              </w:rPr>
+              <w:noBreakHyphen/>
+              <w:t>based forecasting model using ML.NET Singular Spectrum Analysis (SSA).</w:t>
+            </w:r>
+          </w:p>
+        </w:tc>
+        <w:tc>
+          <w:tcPr>
+            <w:tcW w:w="3589" w:type="dxa"/>
+            <w:tcBorders>
+              <w:top w:val="nil"/>
+              <w:left w:val="nil"/>
+              <w:bottom w:val="single" w:sz="8" w:space="0" w:color="E6E6E6"/>
+              <w:right w:val="single" w:sz="8" w:space="0" w:color="E6E6E6"/>
+            </w:tcBorders>
+            <w:shd w:val="clear" w:color="auto" w:fill="auto"/>
+            <w:vAlign w:val="center"/>
+            <w:hideMark/>
+          </w:tcPr>
+          <w:p>
+            <w:pPr>
+              <w:spacing w:after="0" w:line="240" w:lineRule="auto"/>
+              <w:rPr>
+                <w:rFonts w:ascii="Segoe UI" w:eastAsia="Times New Roman" w:hAnsi="Segoe UI" w:cs="Segoe UI"/>
+                <w:color w:val="000000"/>
+                <w:kern w:val="0"/>
+                <w:sz w:val="22"/>
+                <w:szCs w:val="22"/>
+                <w:lang w:eastAsia="en-CA"/>
+                <w14:ligatures w14:val="none"/>
+              </w:rPr>
+            </w:pPr>
+            <w:r>
+              <w:rPr>
+                <w:rFonts w:ascii="Segoe UI" w:eastAsia="Times New Roman" w:hAnsi="Segoe UI" w:cs="Segoe UI"/>
+                <w:color w:val="000000"/>
+                <w:kern w:val="0"/>
+                <w:sz w:val="22"/>
+                <w:szCs w:val="22"/>
+                <w:lang w:eastAsia="en-CA"/>
+                <w14:ligatures w14:val="none"/>
+              </w:rPr>
+              <w:t>The SSA model provides more accurate, data</w:t>
+            </w:r>
+            <w:r>
+              <w:rPr>
+                <w:rFonts w:ascii="Segoe UI" w:eastAsia="Times New Roman" w:hAnsi="Segoe UI" w:cs="Segoe UI"/>
+                <w:color w:val="000000"/>
+                <w:kern w:val="0"/>
+                <w:sz w:val="22"/>
+                <w:szCs w:val="22"/>
+                <w:lang w:eastAsia="en-CA"/>
+                <w14:ligatures w14:val="none"/>
+              </w:rPr>
+              <w:noBreakHyphen/>
+              <w:t>driven, and scalable demand forecasts by analyzing historical time</w:t>
+            </w:r>
+            <w:r>
+              <w:rPr>
+                <w:rFonts w:ascii="Segoe UI" w:eastAsia="Times New Roman" w:hAnsi="Segoe UI" w:cs="Segoe UI"/>
+                <w:color w:val="000000"/>
+                <w:kern w:val="0"/>
+                <w:sz w:val="22"/>
+                <w:szCs w:val="22"/>
+                <w:lang w:eastAsia="en-CA"/>
+                <w14:ligatures w14:val="none"/>
+              </w:rPr>
+              <w:noBreakHyphen/>
+              <w:t>series data, enabling better production planning and dispatch decisions.</w:t>
+            </w:r>
+          </w:p>
+        </w:tc>
+      </w:tr>
+      <w:tr>
+        <w:trPr>
+          <w:trHeight w:val="2280"/>
+        </w:trPr>
+        <w:tc>
+          <w:tcPr>
+            <w:tcW w:w="1859" w:type="dxa"/>
+            <w:tcBorders>
+              <w:top w:val="nil"/>
+              <w:left w:val="single" w:sz="8" w:space="0" w:color="E6E6E6"/>
+              <w:bottom w:val="single" w:sz="8" w:space="0" w:color="E6E6E6"/>
+              <w:right w:val="single" w:sz="8" w:space="0" w:color="E6E6E6"/>
+            </w:tcBorders>
+            <w:shd w:val="clear" w:color="000000" w:fill="F5F5F5"/>
+            <w:vAlign w:val="center"/>
+            <w:hideMark/>
+          </w:tcPr>
+          <w:p>
+            <w:pPr>
+              <w:spacing w:after="0" w:line="240" w:lineRule="auto"/>
+              <w:rPr>
+                <w:rFonts w:ascii="Segoe UI" w:eastAsia="Times New Roman" w:hAnsi="Segoe UI" w:cs="Segoe UI"/>
+                <w:b/>
+                <w:bCs/>
+                <w:color w:val="000000"/>
+                <w:kern w:val="0"/>
+                <w:sz w:val="22"/>
+                <w:szCs w:val="22"/>
+                <w:lang w:eastAsia="en-CA"/>
+                <w14:ligatures w14:val="none"/>
+              </w:rPr>
+            </w:pPr>
+            <w:r>
+              <w:rPr>
+                <w:rFonts w:ascii="Segoe UI" w:eastAsia="Times New Roman" w:hAnsi="Segoe UI" w:cs="Segoe UI"/>
+                <w:b/>
+                <w:bCs/>
+                <w:color w:val="000000"/>
+                <w:kern w:val="0"/>
+                <w:sz w:val="22"/>
+                <w:szCs w:val="22"/>
+                <w:lang w:eastAsia="en-CA"/>
+                <w14:ligatures w14:val="none"/>
+              </w:rPr>
+              <w:lastRenderedPageBreak/>
+              <w:t>Forecasting Integration (New Addition)</w:t>
+            </w:r>
+          </w:p>
+        </w:tc>
+        <w:tc>
+          <w:tcPr>
+            <w:tcW w:w="3392" w:type="dxa"/>
+            <w:tcBorders>
+              <w:top w:val="nil"/>
+              <w:left w:val="nil"/>
+              <w:bottom w:val="single" w:sz="8" w:space="0" w:color="E6E6E6"/>
+              <w:right w:val="single" w:sz="8" w:space="0" w:color="E6E6E6"/>
+            </w:tcBorders>
+            <w:shd w:val="clear" w:color="auto" w:fill="auto"/>
+            <w:vAlign w:val="center"/>
+            <w:hideMark/>
+          </w:tcPr>
+          <w:p>
+            <w:pPr>
+              <w:spacing w:after="0" w:line="240" w:lineRule="auto"/>
+              <w:rPr>
+                <w:rFonts w:ascii="Segoe UI" w:eastAsia="Times New Roman" w:hAnsi="Segoe UI" w:cs="Segoe UI"/>
+                <w:color w:val="000000"/>
+                <w:kern w:val="0"/>
+                <w:sz w:val="22"/>
+                <w:szCs w:val="22"/>
+                <w:lang w:eastAsia="en-CA"/>
+                <w14:ligatures w14:val="none"/>
+              </w:rPr>
+            </w:pPr>
+            <w:r>
+              <w:rPr>
+                <w:rFonts w:ascii="Segoe UI" w:eastAsia="Times New Roman" w:hAnsi="Segoe UI" w:cs="Segoe UI"/>
+                <w:color w:val="000000"/>
+                <w:kern w:val="0"/>
+                <w:sz w:val="22"/>
+                <w:szCs w:val="22"/>
+                <w:lang w:eastAsia="en-CA"/>
+                <w14:ligatures w14:val="none"/>
+              </w:rPr>
+              <w:t>ML</w:t>
+            </w:r>
+            <w:r>
+              <w:rPr>
+                <w:rFonts w:ascii="Segoe UI" w:eastAsia="Times New Roman" w:hAnsi="Segoe UI" w:cs="Segoe UI"/>
+                <w:color w:val="000000"/>
+                <w:kern w:val="0"/>
+                <w:sz w:val="22"/>
+                <w:szCs w:val="22"/>
+                <w:lang w:eastAsia="en-CA"/>
+                <w14:ligatures w14:val="none"/>
+              </w:rPr>
+              <w:noBreakHyphen/>
+              <w:t>based demand forecasting was fully embedded into the operational workflow and used as a core input for vendor recommendations.</w:t>
+            </w:r>
+          </w:p>
+        </w:tc>
+        <w:tc>
+          <w:tcPr>
+            <w:tcW w:w="3589" w:type="dxa"/>
+            <w:tcBorders>
+              <w:top w:val="nil"/>
+              <w:left w:val="nil"/>
+              <w:bottom w:val="single" w:sz="8" w:space="0" w:color="E6E6E6"/>
+              <w:right w:val="single" w:sz="8" w:space="0" w:color="E6E6E6"/>
+            </w:tcBorders>
+            <w:shd w:val="clear" w:color="auto" w:fill="auto"/>
+            <w:vAlign w:val="center"/>
+            <w:hideMark/>
+          </w:tcPr>
+          <w:p>
+            <w:pPr>
+              <w:spacing w:after="0" w:line="240" w:lineRule="auto"/>
+              <w:rPr>
+                <w:rFonts w:ascii="Segoe UI" w:eastAsia="Times New Roman" w:hAnsi="Segoe UI" w:cs="Segoe UI"/>
+                <w:color w:val="000000"/>
+                <w:kern w:val="0"/>
+                <w:sz w:val="22"/>
+                <w:szCs w:val="22"/>
+                <w:lang w:eastAsia="en-CA"/>
+                <w14:ligatures w14:val="none"/>
+              </w:rPr>
+            </w:pPr>
+            <w:r>
+              <w:rPr>
+                <w:rFonts w:ascii="Segoe UI" w:eastAsia="Times New Roman" w:hAnsi="Segoe UI" w:cs="Segoe UI"/>
+                <w:color w:val="000000"/>
+                <w:kern w:val="0"/>
+                <w:sz w:val="22"/>
+                <w:szCs w:val="22"/>
+                <w:lang w:eastAsia="en-CA"/>
+                <w14:ligatures w14:val="none"/>
+              </w:rPr>
+              <w:t>Integrating forecasting directly into decision support improved system intelligence and ensured that recommendations were driven by future demand rather than static historical data.</w:t>
+            </w:r>
+          </w:p>
+        </w:tc>
+      </w:tr>
+      <w:tr>
+        <w:trPr>
+          <w:trHeight w:val="2280"/>
+        </w:trPr>
+        <w:tc>
+          <w:tcPr>
+            <w:tcW w:w="1859" w:type="dxa"/>
+            <w:tcBorders>
+              <w:top w:val="nil"/>
+              <w:left w:val="single" w:sz="8" w:space="0" w:color="E6E6E6"/>
+              <w:bottom w:val="single" w:sz="8" w:space="0" w:color="E6E6E6"/>
+              <w:right w:val="single" w:sz="8" w:space="0" w:color="E6E6E6"/>
+            </w:tcBorders>
+            <w:shd w:val="clear" w:color="000000" w:fill="F5F5F5"/>
+            <w:vAlign w:val="center"/>
+            <w:hideMark/>
+          </w:tcPr>
+          <w:p>
+            <w:pPr>
+              <w:spacing w:after="0" w:line="240" w:lineRule="auto"/>
+              <w:rPr>
+                <w:rFonts w:ascii="Segoe UI" w:eastAsia="Times New Roman" w:hAnsi="Segoe UI" w:cs="Segoe UI"/>
+                <w:b/>
+                <w:bCs/>
+                <w:color w:val="000000"/>
+                <w:kern w:val="0"/>
+                <w:sz w:val="22"/>
+                <w:szCs w:val="22"/>
+                <w:lang w:eastAsia="en-CA"/>
+                <w14:ligatures w14:val="none"/>
+              </w:rPr>
+            </w:pPr>
+            <w:r>
+              <w:rPr>
+                <w:rFonts w:ascii="Segoe UI" w:eastAsia="Times New Roman" w:hAnsi="Segoe UI" w:cs="Segoe UI"/>
+                <w:b/>
+                <w:bCs/>
+                <w:color w:val="000000"/>
+                <w:kern w:val="0"/>
+                <w:sz w:val="22"/>
+                <w:szCs w:val="22"/>
+                <w:lang w:eastAsia="en-CA"/>
+                <w14:ligatures w14:val="none"/>
+              </w:rPr>
+              <w:t>Dashboard Architecture</w:t>
+            </w:r>
+          </w:p>
+        </w:tc>
+        <w:tc>
+          <w:tcPr>
+            <w:tcW w:w="3392" w:type="dxa"/>
+            <w:tcBorders>
+              <w:top w:val="nil"/>
+              <w:left w:val="nil"/>
+              <w:bottom w:val="single" w:sz="8" w:space="0" w:color="E6E6E6"/>
+              <w:right w:val="single" w:sz="8" w:space="0" w:color="E6E6E6"/>
+            </w:tcBorders>
+            <w:shd w:val="clear" w:color="auto" w:fill="auto"/>
+            <w:vAlign w:val="center"/>
+            <w:hideMark/>
+          </w:tcPr>
+          <w:p>
+            <w:pPr>
+              <w:spacing w:after="0" w:line="240" w:lineRule="auto"/>
+              <w:rPr>
+                <w:rFonts w:ascii="Segoe UI" w:eastAsia="Times New Roman" w:hAnsi="Segoe UI" w:cs="Segoe UI"/>
+                <w:color w:val="000000"/>
+                <w:kern w:val="0"/>
+                <w:sz w:val="22"/>
+                <w:szCs w:val="22"/>
+                <w:lang w:eastAsia="en-CA"/>
+                <w14:ligatures w14:val="none"/>
+              </w:rPr>
+            </w:pPr>
+            <w:r>
+              <w:rPr>
+                <w:rFonts w:ascii="Segoe UI" w:eastAsia="Times New Roman" w:hAnsi="Segoe UI" w:cs="Segoe UI"/>
+                <w:color w:val="000000"/>
+                <w:kern w:val="0"/>
+                <w:sz w:val="22"/>
+                <w:szCs w:val="22"/>
+                <w:lang w:eastAsia="en-CA"/>
+                <w14:ligatures w14:val="none"/>
+              </w:rPr>
+              <w:t>The dashboard was upgraded from a static UI design to a fully dynamic, API</w:t>
+            </w:r>
+            <w:r>
+              <w:rPr>
+                <w:rFonts w:ascii="Segoe UI" w:eastAsia="Times New Roman" w:hAnsi="Segoe UI" w:cs="Segoe UI"/>
+                <w:color w:val="000000"/>
+                <w:kern w:val="0"/>
+                <w:sz w:val="22"/>
+                <w:szCs w:val="22"/>
+                <w:lang w:eastAsia="en-CA"/>
+                <w14:ligatures w14:val="none"/>
+              </w:rPr>
+              <w:noBreakHyphen/>
+              <w:t>driven architecture supporting real</w:t>
+            </w:r>
+            <w:r>
+              <w:rPr>
+                <w:rFonts w:ascii="Segoe UI" w:eastAsia="Times New Roman" w:hAnsi="Segoe UI" w:cs="Segoe UI"/>
+                <w:color w:val="000000"/>
+                <w:kern w:val="0"/>
+                <w:sz w:val="22"/>
+                <w:szCs w:val="22"/>
+                <w:lang w:eastAsia="en-CA"/>
+                <w14:ligatures w14:val="none"/>
+              </w:rPr>
+              <w:noBreakHyphen/>
+              <w:t>time data updates.</w:t>
+            </w:r>
+          </w:p>
+        </w:tc>
+        <w:tc>
+          <w:tcPr>
+            <w:tcW w:w="3589" w:type="dxa"/>
+            <w:tcBorders>
+              <w:top w:val="nil"/>
+              <w:left w:val="nil"/>
+              <w:bottom w:val="single" w:sz="8" w:space="0" w:color="E6E6E6"/>
+              <w:right w:val="single" w:sz="8" w:space="0" w:color="E6E6E6"/>
+            </w:tcBorders>
+            <w:shd w:val="clear" w:color="auto" w:fill="auto"/>
+            <w:vAlign w:val="center"/>
+            <w:hideMark/>
+          </w:tcPr>
+          <w:p>
+            <w:pPr>
+              <w:spacing w:after="0" w:line="240" w:lineRule="auto"/>
+              <w:rPr>
+                <w:rFonts w:ascii="Segoe UI" w:eastAsia="Times New Roman" w:hAnsi="Segoe UI" w:cs="Segoe UI"/>
+                <w:color w:val="000000"/>
+                <w:kern w:val="0"/>
+                <w:sz w:val="22"/>
+                <w:szCs w:val="22"/>
+                <w:lang w:eastAsia="en-CA"/>
+                <w14:ligatures w14:val="none"/>
+              </w:rPr>
+            </w:pPr>
+            <w:r>
+              <w:rPr>
+                <w:rFonts w:ascii="Segoe UI" w:eastAsia="Times New Roman" w:hAnsi="Segoe UI" w:cs="Segoe UI"/>
+                <w:color w:val="000000"/>
+                <w:kern w:val="0"/>
+                <w:sz w:val="22"/>
+                <w:szCs w:val="22"/>
+                <w:lang w:eastAsia="en-CA"/>
+                <w14:ligatures w14:val="none"/>
+              </w:rPr>
+              <w:t>This change improved system responsiveness and enabled real</w:t>
+            </w:r>
+            <w:r>
+              <w:rPr>
+                <w:rFonts w:ascii="Segoe UI" w:eastAsia="Times New Roman" w:hAnsi="Segoe UI" w:cs="Segoe UI"/>
+                <w:color w:val="000000"/>
+                <w:kern w:val="0"/>
+                <w:sz w:val="22"/>
+                <w:szCs w:val="22"/>
+                <w:lang w:eastAsia="en-CA"/>
+                <w14:ligatures w14:val="none"/>
+              </w:rPr>
+              <w:noBreakHyphen/>
+              <w:t>time visibility of inventory, requests, forecasts, and recommendations, enhancing user decision</w:t>
+            </w:r>
+            <w:r>
+              <w:rPr>
+                <w:rFonts w:ascii="Segoe UI" w:eastAsia="Times New Roman" w:hAnsi="Segoe UI" w:cs="Segoe UI"/>
+                <w:color w:val="000000"/>
+                <w:kern w:val="0"/>
+                <w:sz w:val="22"/>
+                <w:szCs w:val="22"/>
+                <w:lang w:eastAsia="en-CA"/>
+                <w14:ligatures w14:val="none"/>
+              </w:rPr>
+              <w:noBreakHyphen/>
+              <w:t>making.</w:t>
+            </w:r>
+          </w:p>
+        </w:tc>
+      </w:tr>
+      <w:tr>
+        <w:trPr>
+          <w:trHeight w:val="2280"/>
+        </w:trPr>
+        <w:tc>
+          <w:tcPr>
+            <w:tcW w:w="1859" w:type="dxa"/>
+            <w:tcBorders>
+              <w:top w:val="nil"/>
+              <w:left w:val="single" w:sz="8" w:space="0" w:color="E6E6E6"/>
+              <w:bottom w:val="single" w:sz="8" w:space="0" w:color="E6E6E6"/>
+              <w:right w:val="single" w:sz="8" w:space="0" w:color="E6E6E6"/>
+            </w:tcBorders>
+            <w:shd w:val="clear" w:color="000000" w:fill="F5F5F5"/>
+            <w:vAlign w:val="center"/>
+            <w:hideMark/>
+          </w:tcPr>
+          <w:p>
+            <w:pPr>
+              <w:spacing w:after="0" w:line="240" w:lineRule="auto"/>
+              <w:rPr>
+                <w:rFonts w:ascii="Segoe UI" w:eastAsia="Times New Roman" w:hAnsi="Segoe UI" w:cs="Segoe UI"/>
+                <w:b/>
+                <w:bCs/>
+                <w:color w:val="000000"/>
+                <w:kern w:val="0"/>
+                <w:sz w:val="22"/>
+                <w:szCs w:val="22"/>
+                <w:lang w:eastAsia="en-CA"/>
+                <w14:ligatures w14:val="none"/>
+              </w:rPr>
+            </w:pPr>
+            <w:r>
+              <w:rPr>
+                <w:rFonts w:ascii="Segoe UI" w:eastAsia="Times New Roman" w:hAnsi="Segoe UI" w:cs="Segoe UI"/>
+                <w:b/>
+                <w:bCs/>
+                <w:color w:val="000000"/>
+                <w:kern w:val="0"/>
+                <w:sz w:val="22"/>
+                <w:szCs w:val="22"/>
+                <w:lang w:eastAsia="en-CA"/>
+                <w14:ligatures w14:val="none"/>
+              </w:rPr>
+              <w:t>Authentication and Security</w:t>
+            </w:r>
+          </w:p>
+        </w:tc>
+        <w:tc>
+          <w:tcPr>
+            <w:tcW w:w="3392" w:type="dxa"/>
+            <w:tcBorders>
+              <w:top w:val="nil"/>
+              <w:left w:val="nil"/>
+              <w:bottom w:val="single" w:sz="8" w:space="0" w:color="E6E6E6"/>
+              <w:right w:val="single" w:sz="8" w:space="0" w:color="E6E6E6"/>
+            </w:tcBorders>
+            <w:shd w:val="clear" w:color="auto" w:fill="auto"/>
+            <w:vAlign w:val="center"/>
+            <w:hideMark/>
+          </w:tcPr>
+          <w:p>
+            <w:pPr>
+              <w:spacing w:after="0" w:line="240" w:lineRule="auto"/>
+              <w:rPr>
+                <w:rFonts w:ascii="Segoe UI" w:eastAsia="Times New Roman" w:hAnsi="Segoe UI" w:cs="Segoe UI"/>
+                <w:color w:val="000000"/>
+                <w:kern w:val="0"/>
+                <w:sz w:val="22"/>
+                <w:szCs w:val="22"/>
+                <w:lang w:eastAsia="en-CA"/>
+                <w14:ligatures w14:val="none"/>
+              </w:rPr>
+            </w:pPr>
+            <w:r>
+              <w:rPr>
+                <w:rFonts w:ascii="Segoe UI" w:eastAsia="Times New Roman" w:hAnsi="Segoe UI" w:cs="Segoe UI"/>
+                <w:color w:val="000000"/>
+                <w:kern w:val="0"/>
+                <w:sz w:val="22"/>
+                <w:szCs w:val="22"/>
+                <w:lang w:eastAsia="en-CA"/>
+                <w14:ligatures w14:val="none"/>
+              </w:rPr>
+              <w:t>Role</w:t>
+            </w:r>
+            <w:r>
+              <w:rPr>
+                <w:rFonts w:ascii="Segoe UI" w:eastAsia="Times New Roman" w:hAnsi="Segoe UI" w:cs="Segoe UI"/>
+                <w:color w:val="000000"/>
+                <w:kern w:val="0"/>
+                <w:sz w:val="22"/>
+                <w:szCs w:val="22"/>
+                <w:lang w:eastAsia="en-CA"/>
+                <w14:ligatures w14:val="none"/>
+              </w:rPr>
+              <w:noBreakHyphen/>
+              <w:t>based authentication was implemented using ASP.NET Identity with JWT</w:t>
+            </w:r>
+            <w:r>
+              <w:rPr>
+                <w:rFonts w:ascii="Segoe UI" w:eastAsia="Times New Roman" w:hAnsi="Segoe UI" w:cs="Segoe UI"/>
+                <w:color w:val="000000"/>
+                <w:kern w:val="0"/>
+                <w:sz w:val="22"/>
+                <w:szCs w:val="22"/>
+                <w:lang w:eastAsia="en-CA"/>
+                <w14:ligatures w14:val="none"/>
+              </w:rPr>
+              <w:noBreakHyphen/>
+              <w:t>based authorization.</w:t>
+            </w:r>
+          </w:p>
+        </w:tc>
+        <w:tc>
+          <w:tcPr>
+            <w:tcW w:w="3589" w:type="dxa"/>
+            <w:tcBorders>
+              <w:top w:val="nil"/>
+              <w:left w:val="nil"/>
+              <w:bottom w:val="single" w:sz="8" w:space="0" w:color="E6E6E6"/>
+              <w:right w:val="single" w:sz="8" w:space="0" w:color="E6E6E6"/>
+            </w:tcBorders>
+            <w:shd w:val="clear" w:color="auto" w:fill="auto"/>
+            <w:vAlign w:val="center"/>
+            <w:hideMark/>
+          </w:tcPr>
+          <w:p>
+            <w:pPr>
+              <w:spacing w:after="0" w:line="240" w:lineRule="auto"/>
+              <w:rPr>
+                <w:rFonts w:ascii="Segoe UI" w:eastAsia="Times New Roman" w:hAnsi="Segoe UI" w:cs="Segoe UI"/>
+                <w:color w:val="000000"/>
+                <w:kern w:val="0"/>
+                <w:sz w:val="22"/>
+                <w:szCs w:val="22"/>
+                <w:lang w:eastAsia="en-CA"/>
+                <w14:ligatures w14:val="none"/>
+              </w:rPr>
+            </w:pPr>
+            <w:r>
+              <w:rPr>
+                <w:rFonts w:ascii="Segoe UI" w:eastAsia="Times New Roman" w:hAnsi="Segoe UI" w:cs="Segoe UI"/>
+                <w:color w:val="000000"/>
+                <w:kern w:val="0"/>
+                <w:sz w:val="22"/>
+                <w:szCs w:val="22"/>
+                <w:lang w:eastAsia="en-CA"/>
+                <w14:ligatures w14:val="none"/>
+              </w:rPr>
+              <w:t>Secure role separation was required to protect sensitive data and enforce access control between farmer and vendor functionalities.</w:t>
+            </w:r>
+          </w:p>
+        </w:tc>
+      </w:tr>
+      <w:tr>
+        <w:trPr>
+          <w:trHeight w:val="2280"/>
+        </w:trPr>
+        <w:tc>
+          <w:tcPr>
+            <w:tcW w:w="1859" w:type="dxa"/>
+            <w:tcBorders>
+              <w:top w:val="nil"/>
+              <w:left w:val="single" w:sz="8" w:space="0" w:color="E6E6E6"/>
+              <w:bottom w:val="single" w:sz="8" w:space="0" w:color="E6E6E6"/>
+              <w:right w:val="single" w:sz="8" w:space="0" w:color="E6E6E6"/>
+            </w:tcBorders>
+            <w:shd w:val="clear" w:color="000000" w:fill="F5F5F5"/>
+            <w:vAlign w:val="center"/>
+            <w:hideMark/>
+          </w:tcPr>
+          <w:p>
+            <w:pPr>
+              <w:spacing w:after="0" w:line="240" w:lineRule="auto"/>
+              <w:rPr>
+                <w:rFonts w:ascii="Segoe UI" w:eastAsia="Times New Roman" w:hAnsi="Segoe UI" w:cs="Segoe UI"/>
+                <w:b/>
+                <w:bCs/>
+                <w:color w:val="000000"/>
+                <w:kern w:val="0"/>
+                <w:sz w:val="22"/>
+                <w:szCs w:val="22"/>
+                <w:lang w:eastAsia="en-CA"/>
+                <w14:ligatures w14:val="none"/>
+              </w:rPr>
+            </w:pPr>
+            <w:r>
+              <w:rPr>
+                <w:rFonts w:ascii="Segoe UI" w:eastAsia="Times New Roman" w:hAnsi="Segoe UI" w:cs="Segoe UI"/>
+                <w:b/>
+                <w:bCs/>
+                <w:color w:val="000000"/>
+                <w:kern w:val="0"/>
+                <w:sz w:val="22"/>
+                <w:szCs w:val="22"/>
+                <w:lang w:eastAsia="en-CA"/>
+                <w14:ligatures w14:val="none"/>
+              </w:rPr>
+              <w:t>Recommendation Logic</w:t>
+            </w:r>
+          </w:p>
+        </w:tc>
+        <w:tc>
+          <w:tcPr>
+            <w:tcW w:w="3392" w:type="dxa"/>
+            <w:tcBorders>
+              <w:top w:val="nil"/>
+              <w:left w:val="nil"/>
+              <w:bottom w:val="single" w:sz="8" w:space="0" w:color="E6E6E6"/>
+              <w:right w:val="single" w:sz="8" w:space="0" w:color="E6E6E6"/>
+            </w:tcBorders>
+            <w:shd w:val="clear" w:color="auto" w:fill="auto"/>
+            <w:vAlign w:val="center"/>
+            <w:hideMark/>
+          </w:tcPr>
+          <w:p>
+            <w:pPr>
+              <w:spacing w:after="0" w:line="240" w:lineRule="auto"/>
+              <w:rPr>
+                <w:rFonts w:ascii="Segoe UI" w:eastAsia="Times New Roman" w:hAnsi="Segoe UI" w:cs="Segoe UI"/>
+                <w:color w:val="000000"/>
+                <w:kern w:val="0"/>
+                <w:sz w:val="22"/>
+                <w:szCs w:val="22"/>
+                <w:lang w:eastAsia="en-CA"/>
+                <w14:ligatures w14:val="none"/>
+              </w:rPr>
+            </w:pPr>
+            <w:r>
+              <w:rPr>
+                <w:rFonts w:ascii="Segoe UI" w:eastAsia="Times New Roman" w:hAnsi="Segoe UI" w:cs="Segoe UI"/>
+                <w:color w:val="000000"/>
+                <w:kern w:val="0"/>
+                <w:sz w:val="22"/>
+                <w:szCs w:val="22"/>
+                <w:lang w:eastAsia="en-CA"/>
+                <w14:ligatures w14:val="none"/>
+              </w:rPr>
+              <w:t>The original optimization</w:t>
+            </w:r>
+            <w:r>
+              <w:rPr>
+                <w:rFonts w:ascii="Segoe UI" w:eastAsia="Times New Roman" w:hAnsi="Segoe UI" w:cs="Segoe UI"/>
+                <w:color w:val="000000"/>
+                <w:kern w:val="0"/>
+                <w:sz w:val="22"/>
+                <w:szCs w:val="22"/>
+                <w:lang w:eastAsia="en-CA"/>
+                <w14:ligatures w14:val="none"/>
+              </w:rPr>
+              <w:noBreakHyphen/>
+              <w:t>based approach was simplified into a weighted scoring</w:t>
+            </w:r>
+            <w:r>
+              <w:rPr>
+                <w:rFonts w:ascii="Segoe UI" w:eastAsia="Times New Roman" w:hAnsi="Segoe UI" w:cs="Segoe UI"/>
+                <w:color w:val="000000"/>
+                <w:kern w:val="0"/>
+                <w:sz w:val="22"/>
+                <w:szCs w:val="22"/>
+                <w:lang w:eastAsia="en-CA"/>
+                <w14:ligatures w14:val="none"/>
+              </w:rPr>
+              <w:noBreakHyphen/>
+              <w:t>based recommendation system.</w:t>
+            </w:r>
+          </w:p>
+        </w:tc>
+        <w:tc>
+          <w:tcPr>
+            <w:tcW w:w="3589" w:type="dxa"/>
+            <w:tcBorders>
+              <w:top w:val="nil"/>
+              <w:left w:val="nil"/>
+              <w:bottom w:val="single" w:sz="8" w:space="0" w:color="E6E6E6"/>
+              <w:right w:val="single" w:sz="8" w:space="0" w:color="E6E6E6"/>
+            </w:tcBorders>
+            <w:shd w:val="clear" w:color="auto" w:fill="auto"/>
+            <w:vAlign w:val="center"/>
+            <w:hideMark/>
+          </w:tcPr>
+          <w:p>
+            <w:pPr>
+              <w:spacing w:after="0" w:line="240" w:lineRule="auto"/>
+              <w:rPr>
+                <w:rFonts w:ascii="Segoe UI" w:eastAsia="Times New Roman" w:hAnsi="Segoe UI" w:cs="Segoe UI"/>
+                <w:color w:val="000000"/>
+                <w:kern w:val="0"/>
+                <w:sz w:val="22"/>
+                <w:szCs w:val="22"/>
+                <w:lang w:eastAsia="en-CA"/>
+                <w14:ligatures w14:val="none"/>
+              </w:rPr>
+            </w:pPr>
+            <w:r>
+              <w:rPr>
+                <w:rFonts w:ascii="Segoe UI" w:eastAsia="Times New Roman" w:hAnsi="Segoe UI" w:cs="Segoe UI"/>
+                <w:color w:val="000000"/>
+                <w:kern w:val="0"/>
+                <w:sz w:val="22"/>
+                <w:szCs w:val="22"/>
+                <w:lang w:eastAsia="en-CA"/>
+                <w14:ligatures w14:val="none"/>
+              </w:rPr>
+              <w:t>The scoring approach improved interpretability and usability, making recommendation logic easier for non</w:t>
+            </w:r>
+            <w:r>
+              <w:rPr>
+                <w:rFonts w:ascii="Segoe UI" w:eastAsia="Times New Roman" w:hAnsi="Segoe UI" w:cs="Segoe UI"/>
+                <w:color w:val="000000"/>
+                <w:kern w:val="0"/>
+                <w:sz w:val="22"/>
+                <w:szCs w:val="22"/>
+                <w:lang w:eastAsia="en-CA"/>
+                <w14:ligatures w14:val="none"/>
+              </w:rPr>
+              <w:noBreakHyphen/>
+              <w:t>technical agricultural users to understand and trust.</w:t>
+            </w:r>
+          </w:p>
+        </w:tc>
+      </w:tr>
+      <w:tr>
+        <w:trPr>
+          <w:trHeight w:val="2280"/>
+        </w:trPr>
+        <w:tc>
+          <w:tcPr>
+            <w:tcW w:w="1859" w:type="dxa"/>
+            <w:tcBorders>
+              <w:top w:val="nil"/>
+              <w:left w:val="single" w:sz="8" w:space="0" w:color="E6E6E6"/>
+              <w:bottom w:val="single" w:sz="8" w:space="0" w:color="E6E6E6"/>
+              <w:right w:val="single" w:sz="8" w:space="0" w:color="E6E6E6"/>
+            </w:tcBorders>
+            <w:shd w:val="clear" w:color="000000" w:fill="F5F5F5"/>
+            <w:vAlign w:val="center"/>
+            <w:hideMark/>
+          </w:tcPr>
+          <w:p>
+            <w:pPr>
+              <w:spacing w:after="0" w:line="240" w:lineRule="auto"/>
+              <w:rPr>
+                <w:rFonts w:ascii="Segoe UI" w:eastAsia="Times New Roman" w:hAnsi="Segoe UI" w:cs="Segoe UI"/>
+                <w:b/>
+                <w:bCs/>
+                <w:color w:val="000000"/>
+                <w:kern w:val="0"/>
+                <w:sz w:val="22"/>
+                <w:szCs w:val="22"/>
+                <w:lang w:eastAsia="en-CA"/>
+                <w14:ligatures w14:val="none"/>
+              </w:rPr>
+            </w:pPr>
+            <w:r>
+              <w:rPr>
+                <w:rFonts w:ascii="Segoe UI" w:eastAsia="Times New Roman" w:hAnsi="Segoe UI" w:cs="Segoe UI"/>
+                <w:b/>
+                <w:bCs/>
+                <w:color w:val="000000"/>
+                <w:kern w:val="0"/>
+                <w:sz w:val="22"/>
+                <w:szCs w:val="22"/>
+                <w:lang w:eastAsia="en-CA"/>
+                <w14:ligatures w14:val="none"/>
+              </w:rPr>
+              <w:t>Relationship Tracking Enhancement</w:t>
+            </w:r>
+          </w:p>
+        </w:tc>
+        <w:tc>
+          <w:tcPr>
+            <w:tcW w:w="3392" w:type="dxa"/>
+            <w:tcBorders>
+              <w:top w:val="nil"/>
+              <w:left w:val="nil"/>
+              <w:bottom w:val="single" w:sz="8" w:space="0" w:color="E6E6E6"/>
+              <w:right w:val="single" w:sz="8" w:space="0" w:color="E6E6E6"/>
+            </w:tcBorders>
+            <w:shd w:val="clear" w:color="auto" w:fill="auto"/>
+            <w:vAlign w:val="center"/>
+            <w:hideMark/>
+          </w:tcPr>
+          <w:p>
+            <w:pPr>
+              <w:spacing w:after="0" w:line="240" w:lineRule="auto"/>
+              <w:rPr>
+                <w:rFonts w:ascii="Segoe UI" w:eastAsia="Times New Roman" w:hAnsi="Segoe UI" w:cs="Segoe UI"/>
+                <w:color w:val="000000"/>
+                <w:kern w:val="0"/>
+                <w:sz w:val="22"/>
+                <w:szCs w:val="22"/>
+                <w:lang w:eastAsia="en-CA"/>
+                <w14:ligatures w14:val="none"/>
+              </w:rPr>
+            </w:pPr>
+            <w:r>
+              <w:rPr>
+                <w:rFonts w:ascii="Segoe UI" w:eastAsia="Times New Roman" w:hAnsi="Segoe UI" w:cs="Segoe UI"/>
+                <w:color w:val="000000"/>
+                <w:kern w:val="0"/>
+                <w:sz w:val="22"/>
+                <w:szCs w:val="22"/>
+                <w:lang w:eastAsia="en-CA"/>
+                <w14:ligatures w14:val="none"/>
+              </w:rPr>
+              <w:t>A new relationship</w:t>
+            </w:r>
+            <w:r>
+              <w:rPr>
+                <w:rFonts w:ascii="Segoe UI" w:eastAsia="Times New Roman" w:hAnsi="Segoe UI" w:cs="Segoe UI"/>
+                <w:color w:val="000000"/>
+                <w:kern w:val="0"/>
+                <w:sz w:val="22"/>
+                <w:szCs w:val="22"/>
+                <w:lang w:eastAsia="en-CA"/>
+                <w14:ligatures w14:val="none"/>
+              </w:rPr>
+              <w:noBreakHyphen/>
+              <w:t>tracking entity was introduced to record historical farmer–vendor interactions and compute a relationship score.</w:t>
+            </w:r>
+          </w:p>
+        </w:tc>
+        <w:tc>
+          <w:tcPr>
+            <w:tcW w:w="3589" w:type="dxa"/>
+            <w:tcBorders>
+              <w:top w:val="nil"/>
+              <w:left w:val="nil"/>
+              <w:bottom w:val="single" w:sz="8" w:space="0" w:color="E6E6E6"/>
+              <w:right w:val="single" w:sz="8" w:space="0" w:color="E6E6E6"/>
+            </w:tcBorders>
+            <w:shd w:val="clear" w:color="auto" w:fill="auto"/>
+            <w:vAlign w:val="center"/>
+            <w:hideMark/>
+          </w:tcPr>
+          <w:p>
+            <w:pPr>
+              <w:spacing w:after="0" w:line="240" w:lineRule="auto"/>
+              <w:rPr>
+                <w:rFonts w:ascii="Segoe UI" w:eastAsia="Times New Roman" w:hAnsi="Segoe UI" w:cs="Segoe UI"/>
+                <w:color w:val="000000"/>
+                <w:kern w:val="0"/>
+                <w:sz w:val="22"/>
+                <w:szCs w:val="22"/>
+                <w:lang w:eastAsia="en-CA"/>
+                <w14:ligatures w14:val="none"/>
+              </w:rPr>
+            </w:pPr>
+            <w:r>
+              <w:rPr>
+                <w:rFonts w:ascii="Segoe UI" w:eastAsia="Times New Roman" w:hAnsi="Segoe UI" w:cs="Segoe UI"/>
+                <w:color w:val="000000"/>
+                <w:kern w:val="0"/>
+                <w:sz w:val="22"/>
+                <w:szCs w:val="22"/>
+                <w:lang w:eastAsia="en-CA"/>
+                <w14:ligatures w14:val="none"/>
+              </w:rPr>
+              <w:t>Including relationship history improved recommendation accuracy by accounting for prior collaboration performance and trust.</w:t>
+            </w:r>
+          </w:p>
+        </w:tc>
+      </w:tr>
+      <w:tr>
+        <w:trPr>
+          <w:trHeight w:val="2280"/>
+        </w:trPr>
+        <w:tc>
+          <w:tcPr>
+            <w:tcW w:w="1859" w:type="dxa"/>
+            <w:tcBorders>
+              <w:top w:val="nil"/>
+              <w:left w:val="single" w:sz="8" w:space="0" w:color="E6E6E6"/>
+              <w:bottom w:val="single" w:sz="8" w:space="0" w:color="E6E6E6"/>
+              <w:right w:val="single" w:sz="8" w:space="0" w:color="E6E6E6"/>
+            </w:tcBorders>
+            <w:shd w:val="clear" w:color="000000" w:fill="F5F5F5"/>
+            <w:vAlign w:val="center"/>
+            <w:hideMark/>
+          </w:tcPr>
+          <w:p>
+            <w:pPr>
+              <w:spacing w:after="0" w:line="240" w:lineRule="auto"/>
+              <w:rPr>
+                <w:rFonts w:ascii="Segoe UI" w:eastAsia="Times New Roman" w:hAnsi="Segoe UI" w:cs="Segoe UI"/>
+                <w:b/>
+                <w:bCs/>
+                <w:color w:val="000000"/>
+                <w:kern w:val="0"/>
+                <w:sz w:val="22"/>
+                <w:szCs w:val="22"/>
+                <w:lang w:eastAsia="en-CA"/>
+                <w14:ligatures w14:val="none"/>
+              </w:rPr>
+            </w:pPr>
+            <w:r>
+              <w:rPr>
+                <w:rFonts w:ascii="Segoe UI" w:eastAsia="Times New Roman" w:hAnsi="Segoe UI" w:cs="Segoe UI"/>
+                <w:b/>
+                <w:bCs/>
+                <w:color w:val="000000"/>
+                <w:kern w:val="0"/>
+                <w:sz w:val="22"/>
+                <w:szCs w:val="22"/>
+                <w:lang w:eastAsia="en-CA"/>
+                <w14:ligatures w14:val="none"/>
+              </w:rPr>
+              <w:lastRenderedPageBreak/>
+              <w:t>Location Feature</w:t>
+            </w:r>
+          </w:p>
+        </w:tc>
+        <w:tc>
+          <w:tcPr>
+            <w:tcW w:w="3392" w:type="dxa"/>
+            <w:tcBorders>
+              <w:top w:val="nil"/>
+              <w:left w:val="nil"/>
+              <w:bottom w:val="single" w:sz="8" w:space="0" w:color="E6E6E6"/>
+              <w:right w:val="single" w:sz="8" w:space="0" w:color="E6E6E6"/>
+            </w:tcBorders>
+            <w:shd w:val="clear" w:color="auto" w:fill="auto"/>
+            <w:vAlign w:val="center"/>
+            <w:hideMark/>
+          </w:tcPr>
+          <w:p>
+            <w:pPr>
+              <w:spacing w:after="0" w:line="240" w:lineRule="auto"/>
+              <w:rPr>
+                <w:rFonts w:ascii="Segoe UI" w:eastAsia="Times New Roman" w:hAnsi="Segoe UI" w:cs="Segoe UI"/>
+                <w:color w:val="000000"/>
+                <w:kern w:val="0"/>
+                <w:sz w:val="22"/>
+                <w:szCs w:val="22"/>
+                <w:lang w:eastAsia="en-CA"/>
+                <w14:ligatures w14:val="none"/>
+              </w:rPr>
+            </w:pPr>
+            <w:r>
+              <w:rPr>
+                <w:rFonts w:ascii="Segoe UI" w:eastAsia="Times New Roman" w:hAnsi="Segoe UI" w:cs="Segoe UI"/>
+                <w:color w:val="000000"/>
+                <w:kern w:val="0"/>
+                <w:sz w:val="22"/>
+                <w:szCs w:val="22"/>
+                <w:lang w:eastAsia="en-CA"/>
+                <w14:ligatures w14:val="none"/>
+              </w:rPr>
+              <w:t>Latitude and longitude fields were added to user profiles to support geospatial calculations.</w:t>
+            </w:r>
+          </w:p>
+        </w:tc>
+        <w:tc>
+          <w:tcPr>
+            <w:tcW w:w="3589" w:type="dxa"/>
+            <w:tcBorders>
+              <w:top w:val="nil"/>
+              <w:left w:val="nil"/>
+              <w:bottom w:val="single" w:sz="8" w:space="0" w:color="E6E6E6"/>
+              <w:right w:val="single" w:sz="8" w:space="0" w:color="E6E6E6"/>
+            </w:tcBorders>
+            <w:shd w:val="clear" w:color="auto" w:fill="auto"/>
+            <w:vAlign w:val="center"/>
+            <w:hideMark/>
+          </w:tcPr>
+          <w:p>
+            <w:pPr>
+              <w:spacing w:after="0" w:line="240" w:lineRule="auto"/>
+              <w:rPr>
+                <w:rFonts w:ascii="Segoe UI" w:eastAsia="Times New Roman" w:hAnsi="Segoe UI" w:cs="Segoe UI"/>
+                <w:color w:val="000000"/>
+                <w:kern w:val="0"/>
+                <w:sz w:val="22"/>
+                <w:szCs w:val="22"/>
+                <w:lang w:eastAsia="en-CA"/>
+                <w14:ligatures w14:val="none"/>
+              </w:rPr>
+            </w:pPr>
+            <w:r>
+              <w:rPr>
+                <w:rFonts w:ascii="Segoe UI" w:eastAsia="Times New Roman" w:hAnsi="Segoe UI" w:cs="Segoe UI"/>
+                <w:color w:val="000000"/>
+                <w:kern w:val="0"/>
+                <w:sz w:val="22"/>
+                <w:szCs w:val="22"/>
+                <w:lang w:eastAsia="en-CA"/>
+                <w14:ligatures w14:val="none"/>
+              </w:rPr>
+              <w:t>Geolocation data is required to compute distances between farmers and vendors, which is essential for distance</w:t>
+            </w:r>
+            <w:r>
+              <w:rPr>
+                <w:rFonts w:ascii="Segoe UI" w:eastAsia="Times New Roman" w:hAnsi="Segoe UI" w:cs="Segoe UI"/>
+                <w:color w:val="000000"/>
+                <w:kern w:val="0"/>
+                <w:sz w:val="22"/>
+                <w:szCs w:val="22"/>
+                <w:lang w:eastAsia="en-CA"/>
+                <w14:ligatures w14:val="none"/>
+              </w:rPr>
+              <w:noBreakHyphen/>
+              <w:t>based ranking and logistics optimization.</w:t>
+            </w:r>
+          </w:p>
+        </w:tc>
+      </w:tr>
+      <w:tr>
+        <w:trPr>
+          <w:trHeight w:val="2280"/>
+        </w:trPr>
+        <w:tc>
+          <w:tcPr>
+            <w:tcW w:w="1859" w:type="dxa"/>
+            <w:tcBorders>
+              <w:top w:val="nil"/>
+              <w:left w:val="single" w:sz="8" w:space="0" w:color="E6E6E6"/>
+              <w:bottom w:val="single" w:sz="8" w:space="0" w:color="E6E6E6"/>
+              <w:right w:val="single" w:sz="8" w:space="0" w:color="E6E6E6"/>
+            </w:tcBorders>
+            <w:shd w:val="clear" w:color="000000" w:fill="F5F5F5"/>
+            <w:vAlign w:val="center"/>
+            <w:hideMark/>
+          </w:tcPr>
+          <w:p>
+            <w:pPr>
+              <w:spacing w:after="0" w:line="240" w:lineRule="auto"/>
+              <w:rPr>
+                <w:rFonts w:ascii="Segoe UI" w:eastAsia="Times New Roman" w:hAnsi="Segoe UI" w:cs="Segoe UI"/>
+                <w:b/>
+                <w:bCs/>
+                <w:color w:val="000000"/>
+                <w:kern w:val="0"/>
+                <w:sz w:val="22"/>
+                <w:szCs w:val="22"/>
+                <w:lang w:eastAsia="en-CA"/>
+                <w14:ligatures w14:val="none"/>
+              </w:rPr>
+            </w:pPr>
+            <w:r>
+              <w:rPr>
+                <w:rFonts w:ascii="Segoe UI" w:eastAsia="Times New Roman" w:hAnsi="Segoe UI" w:cs="Segoe UI"/>
+                <w:b/>
+                <w:bCs/>
+                <w:color w:val="000000"/>
+                <w:kern w:val="0"/>
+                <w:sz w:val="22"/>
+                <w:szCs w:val="22"/>
+                <w:lang w:eastAsia="en-CA"/>
+                <w14:ligatures w14:val="none"/>
+              </w:rPr>
+              <w:t>Data Generation Strategy</w:t>
+            </w:r>
+          </w:p>
+        </w:tc>
+        <w:tc>
+          <w:tcPr>
+            <w:tcW w:w="3392" w:type="dxa"/>
+            <w:tcBorders>
+              <w:top w:val="nil"/>
+              <w:left w:val="nil"/>
+              <w:bottom w:val="single" w:sz="8" w:space="0" w:color="E6E6E6"/>
+              <w:right w:val="single" w:sz="8" w:space="0" w:color="E6E6E6"/>
+            </w:tcBorders>
+            <w:shd w:val="clear" w:color="auto" w:fill="auto"/>
+            <w:vAlign w:val="center"/>
+            <w:hideMark/>
+          </w:tcPr>
+          <w:p>
+            <w:pPr>
+              <w:spacing w:after="0" w:line="240" w:lineRule="auto"/>
+              <w:rPr>
+                <w:rFonts w:ascii="Segoe UI" w:eastAsia="Times New Roman" w:hAnsi="Segoe UI" w:cs="Segoe UI"/>
+                <w:color w:val="000000"/>
+                <w:kern w:val="0"/>
+                <w:sz w:val="22"/>
+                <w:szCs w:val="22"/>
+                <w:lang w:eastAsia="en-CA"/>
+                <w14:ligatures w14:val="none"/>
+              </w:rPr>
+            </w:pPr>
+            <w:r>
+              <w:rPr>
+                <w:rFonts w:ascii="Segoe UI" w:eastAsia="Times New Roman" w:hAnsi="Segoe UI" w:cs="Segoe UI"/>
+                <w:color w:val="000000"/>
+                <w:kern w:val="0"/>
+                <w:sz w:val="22"/>
+                <w:szCs w:val="22"/>
+                <w:lang w:eastAsia="en-CA"/>
+                <w14:ligatures w14:val="none"/>
+              </w:rPr>
+              <w:t>The initial simulated dataset approach was enhanced to include multi</w:t>
+            </w:r>
+            <w:r>
+              <w:rPr>
+                <w:rFonts w:ascii="Segoe UI" w:eastAsia="Times New Roman" w:hAnsi="Segoe UI" w:cs="Segoe UI"/>
+                <w:color w:val="000000"/>
+                <w:kern w:val="0"/>
+                <w:sz w:val="22"/>
+                <w:szCs w:val="22"/>
+                <w:lang w:eastAsia="en-CA"/>
+                <w14:ligatures w14:val="none"/>
+              </w:rPr>
+              <w:noBreakHyphen/>
+              <w:t>period historical demand, inventory, and dispatch data.</w:t>
+            </w:r>
+          </w:p>
+        </w:tc>
+        <w:tc>
+          <w:tcPr>
+            <w:tcW w:w="3589" w:type="dxa"/>
+            <w:tcBorders>
+              <w:top w:val="nil"/>
+              <w:left w:val="nil"/>
+              <w:bottom w:val="single" w:sz="8" w:space="0" w:color="E6E6E6"/>
+              <w:right w:val="single" w:sz="8" w:space="0" w:color="E6E6E6"/>
+            </w:tcBorders>
+            <w:shd w:val="clear" w:color="auto" w:fill="auto"/>
+            <w:vAlign w:val="center"/>
+            <w:hideMark/>
+          </w:tcPr>
+          <w:p>
+            <w:pPr>
+              <w:spacing w:after="0" w:line="240" w:lineRule="auto"/>
+              <w:rPr>
+                <w:rFonts w:ascii="Segoe UI" w:eastAsia="Times New Roman" w:hAnsi="Segoe UI" w:cs="Segoe UI"/>
+                <w:color w:val="000000"/>
+                <w:kern w:val="0"/>
+                <w:sz w:val="22"/>
+                <w:szCs w:val="22"/>
+                <w:lang w:eastAsia="en-CA"/>
+                <w14:ligatures w14:val="none"/>
+              </w:rPr>
+            </w:pPr>
+            <w:r>
+              <w:rPr>
+                <w:rFonts w:ascii="Segoe UI" w:eastAsia="Times New Roman" w:hAnsi="Segoe UI" w:cs="Segoe UI"/>
+                <w:color w:val="000000"/>
+                <w:kern w:val="0"/>
+                <w:sz w:val="22"/>
+                <w:szCs w:val="22"/>
+                <w:lang w:eastAsia="en-CA"/>
+                <w14:ligatures w14:val="none"/>
+              </w:rPr>
+              <w:t>More realistic historical data was necessary to support reliable machine learning forecasting and to reflect real</w:t>
+            </w:r>
+            <w:r>
+              <w:rPr>
+                <w:rFonts w:ascii="Segoe UI" w:eastAsia="Times New Roman" w:hAnsi="Segoe UI" w:cs="Segoe UI"/>
+                <w:color w:val="000000"/>
+                <w:kern w:val="0"/>
+                <w:sz w:val="22"/>
+                <w:szCs w:val="22"/>
+                <w:lang w:eastAsia="en-CA"/>
+                <w14:ligatures w14:val="none"/>
+              </w:rPr>
+              <w:noBreakHyphen/>
+              <w:t>world agricultural scenarios.</w:t>
+            </w:r>
+          </w:p>
+        </w:tc>
+      </w:tr>
+      <w:tr>
+        <w:trPr>
+          <w:trHeight w:val="2280"/>
+        </w:trPr>
+        <w:tc>
+          <w:tcPr>
+            <w:tcW w:w="1859" w:type="dxa"/>
+            <w:tcBorders>
+              <w:top w:val="nil"/>
+              <w:left w:val="single" w:sz="8" w:space="0" w:color="E6E6E6"/>
+              <w:bottom w:val="single" w:sz="8" w:space="0" w:color="E6E6E6"/>
+              <w:right w:val="single" w:sz="8" w:space="0" w:color="E6E6E6"/>
+            </w:tcBorders>
+            <w:shd w:val="clear" w:color="000000" w:fill="F5F5F5"/>
+            <w:vAlign w:val="center"/>
+            <w:hideMark/>
+          </w:tcPr>
+          <w:p>
+            <w:pPr>
+              <w:spacing w:after="0" w:line="240" w:lineRule="auto"/>
+              <w:rPr>
+                <w:rFonts w:ascii="Segoe UI" w:eastAsia="Times New Roman" w:hAnsi="Segoe UI" w:cs="Segoe UI"/>
+                <w:b/>
+                <w:bCs/>
+                <w:color w:val="000000"/>
+                <w:kern w:val="0"/>
+                <w:sz w:val="22"/>
+                <w:szCs w:val="22"/>
+                <w:lang w:eastAsia="en-CA"/>
+                <w14:ligatures w14:val="none"/>
+              </w:rPr>
+            </w:pPr>
+            <w:r>
+              <w:rPr>
+                <w:rFonts w:ascii="Segoe UI" w:eastAsia="Times New Roman" w:hAnsi="Segoe UI" w:cs="Segoe UI"/>
+                <w:b/>
+                <w:bCs/>
+                <w:color w:val="000000"/>
+                <w:kern w:val="0"/>
+                <w:sz w:val="22"/>
+                <w:szCs w:val="22"/>
+                <w:lang w:eastAsia="en-CA"/>
+                <w14:ligatures w14:val="none"/>
+              </w:rPr>
+              <w:t>User Experience Improvements</w:t>
+            </w:r>
+          </w:p>
+        </w:tc>
+        <w:tc>
+          <w:tcPr>
+            <w:tcW w:w="3392" w:type="dxa"/>
+            <w:tcBorders>
+              <w:top w:val="nil"/>
+              <w:left w:val="nil"/>
+              <w:bottom w:val="single" w:sz="8" w:space="0" w:color="E6E6E6"/>
+              <w:right w:val="single" w:sz="8" w:space="0" w:color="E6E6E6"/>
+            </w:tcBorders>
+            <w:shd w:val="clear" w:color="auto" w:fill="auto"/>
+            <w:vAlign w:val="center"/>
+            <w:hideMark/>
+          </w:tcPr>
+          <w:p>
+            <w:pPr>
+              <w:spacing w:after="0" w:line="240" w:lineRule="auto"/>
+              <w:rPr>
+                <w:rFonts w:ascii="Segoe UI" w:eastAsia="Times New Roman" w:hAnsi="Segoe UI" w:cs="Segoe UI"/>
+                <w:color w:val="000000"/>
+                <w:kern w:val="0"/>
+                <w:sz w:val="22"/>
+                <w:szCs w:val="22"/>
+                <w:lang w:eastAsia="en-CA"/>
+                <w14:ligatures w14:val="none"/>
+              </w:rPr>
+            </w:pPr>
+            <w:r>
+              <w:rPr>
+                <w:rFonts w:ascii="Segoe UI" w:eastAsia="Times New Roman" w:hAnsi="Segoe UI" w:cs="Segoe UI"/>
+                <w:color w:val="000000"/>
+                <w:kern w:val="0"/>
+                <w:sz w:val="22"/>
+                <w:szCs w:val="22"/>
+                <w:lang w:eastAsia="en-CA"/>
+                <w14:ligatures w14:val="none"/>
+              </w:rPr>
+              <w:t>Searchable dropdowns, improved navigation through a shared sidebar layout, and improved input validation were introduced.</w:t>
+            </w:r>
+          </w:p>
+        </w:tc>
+        <w:tc>
+          <w:tcPr>
+            <w:tcW w:w="3589" w:type="dxa"/>
+            <w:tcBorders>
+              <w:top w:val="nil"/>
+              <w:left w:val="nil"/>
+              <w:bottom w:val="single" w:sz="8" w:space="0" w:color="E6E6E6"/>
+              <w:right w:val="single" w:sz="8" w:space="0" w:color="E6E6E6"/>
+            </w:tcBorders>
+            <w:shd w:val="clear" w:color="auto" w:fill="auto"/>
+            <w:vAlign w:val="center"/>
+            <w:hideMark/>
+          </w:tcPr>
+          <w:p>
+            <w:pPr>
+              <w:spacing w:after="0" w:line="240" w:lineRule="auto"/>
+              <w:rPr>
+                <w:rFonts w:ascii="Segoe UI" w:eastAsia="Times New Roman" w:hAnsi="Segoe UI" w:cs="Segoe UI"/>
+                <w:color w:val="000000"/>
+                <w:kern w:val="0"/>
+                <w:sz w:val="22"/>
+                <w:szCs w:val="22"/>
+                <w:lang w:eastAsia="en-CA"/>
+                <w14:ligatures w14:val="none"/>
+              </w:rPr>
+            </w:pPr>
+            <w:r>
+              <w:rPr>
+                <w:rFonts w:ascii="Segoe UI" w:eastAsia="Times New Roman" w:hAnsi="Segoe UI" w:cs="Segoe UI"/>
+                <w:color w:val="000000"/>
+                <w:kern w:val="0"/>
+                <w:sz w:val="22"/>
+                <w:szCs w:val="22"/>
+                <w:lang w:eastAsia="en-CA"/>
+                <w14:ligatures w14:val="none"/>
+              </w:rPr>
+              <w:t>These changes significantly improved usability, reduced user errors, and enhanced overall interaction efficiency for both farmer and vendor roles.</w:t>
+            </w:r>
+          </w:p>
+        </w:tc>
+      </w:tr>
+      <w:tr>
+        <w:trPr>
+          <w:trHeight w:val="2280"/>
+        </w:trPr>
+        <w:tc>
+          <w:tcPr>
+            <w:tcW w:w="1859" w:type="dxa"/>
+            <w:tcBorders>
+              <w:top w:val="nil"/>
+              <w:left w:val="single" w:sz="8" w:space="0" w:color="E6E6E6"/>
+              <w:bottom w:val="single" w:sz="8" w:space="0" w:color="E6E6E6"/>
+              <w:right w:val="single" w:sz="8" w:space="0" w:color="E6E6E6"/>
+            </w:tcBorders>
+            <w:shd w:val="clear" w:color="000000" w:fill="F5F5F5"/>
+            <w:vAlign w:val="center"/>
+            <w:hideMark/>
+          </w:tcPr>
+          <w:p>
+            <w:pPr>
+              <w:spacing w:after="0" w:line="240" w:lineRule="auto"/>
+              <w:rPr>
+                <w:rFonts w:ascii="Segoe UI" w:eastAsia="Times New Roman" w:hAnsi="Segoe UI" w:cs="Segoe UI"/>
+                <w:b/>
+                <w:bCs/>
+                <w:color w:val="000000"/>
+                <w:kern w:val="0"/>
+                <w:sz w:val="22"/>
+                <w:szCs w:val="22"/>
+                <w:lang w:eastAsia="en-CA"/>
+                <w14:ligatures w14:val="none"/>
+              </w:rPr>
+            </w:pPr>
+            <w:r>
+              <w:rPr>
+                <w:rFonts w:ascii="Segoe UI" w:eastAsia="Times New Roman" w:hAnsi="Segoe UI" w:cs="Segoe UI"/>
+                <w:b/>
+                <w:bCs/>
+                <w:color w:val="000000"/>
+                <w:kern w:val="0"/>
+                <w:sz w:val="22"/>
+                <w:szCs w:val="22"/>
+                <w:lang w:eastAsia="en-CA"/>
+                <w14:ligatures w14:val="none"/>
+              </w:rPr>
+              <w:t>Chat Module</w:t>
+            </w:r>
+          </w:p>
+        </w:tc>
+        <w:tc>
+          <w:tcPr>
+            <w:tcW w:w="3392" w:type="dxa"/>
+            <w:tcBorders>
+              <w:top w:val="nil"/>
+              <w:left w:val="nil"/>
+              <w:bottom w:val="single" w:sz="8" w:space="0" w:color="E6E6E6"/>
+              <w:right w:val="single" w:sz="8" w:space="0" w:color="E6E6E6"/>
+            </w:tcBorders>
+            <w:shd w:val="clear" w:color="auto" w:fill="auto"/>
+            <w:vAlign w:val="center"/>
+            <w:hideMark/>
+          </w:tcPr>
+          <w:p>
+            <w:pPr>
+              <w:spacing w:after="0" w:line="240" w:lineRule="auto"/>
+              <w:rPr>
+                <w:rFonts w:ascii="Segoe UI" w:eastAsia="Times New Roman" w:hAnsi="Segoe UI" w:cs="Segoe UI"/>
+                <w:color w:val="000000"/>
+                <w:kern w:val="0"/>
+                <w:sz w:val="22"/>
+                <w:szCs w:val="22"/>
+                <w:lang w:eastAsia="en-CA"/>
+                <w14:ligatures w14:val="none"/>
+              </w:rPr>
+            </w:pPr>
+            <w:r>
+              <w:rPr>
+                <w:rFonts w:ascii="Segoe UI" w:eastAsia="Times New Roman" w:hAnsi="Segoe UI" w:cs="Segoe UI"/>
+                <w:color w:val="000000"/>
+                <w:kern w:val="0"/>
+                <w:sz w:val="22"/>
+                <w:szCs w:val="22"/>
+                <w:lang w:eastAsia="en-CA"/>
+                <w14:ligatures w14:val="none"/>
+              </w:rPr>
+              <w:t>A real</w:t>
+            </w:r>
+            <w:r>
+              <w:rPr>
+                <w:rFonts w:ascii="Segoe UI" w:eastAsia="Times New Roman" w:hAnsi="Segoe UI" w:cs="Segoe UI"/>
+                <w:color w:val="000000"/>
+                <w:kern w:val="0"/>
+                <w:sz w:val="22"/>
+                <w:szCs w:val="22"/>
+                <w:lang w:eastAsia="en-CA"/>
+                <w14:ligatures w14:val="none"/>
+              </w:rPr>
+              <w:noBreakHyphen/>
+              <w:t xml:space="preserve">time communication module was added using </w:t>
+            </w:r>
+            <w:proofErr w:type="spellStart"/>
+            <w:r>
+              <w:rPr>
+                <w:rFonts w:ascii="Segoe UI" w:eastAsia="Times New Roman" w:hAnsi="Segoe UI" w:cs="Segoe UI"/>
+                <w:color w:val="000000"/>
+                <w:kern w:val="0"/>
+                <w:sz w:val="22"/>
+                <w:szCs w:val="22"/>
+                <w:lang w:eastAsia="en-CA"/>
+                <w14:ligatures w14:val="none"/>
+              </w:rPr>
+              <w:t>SignalR</w:t>
+            </w:r>
+            <w:proofErr w:type="spellEnd"/>
+            <w:r>
+              <w:rPr>
+                <w:rFonts w:ascii="Segoe UI" w:eastAsia="Times New Roman" w:hAnsi="Segoe UI" w:cs="Segoe UI"/>
+                <w:color w:val="000000"/>
+                <w:kern w:val="0"/>
+                <w:sz w:val="22"/>
+                <w:szCs w:val="22"/>
+                <w:lang w:eastAsia="en-CA"/>
+                <w14:ligatures w14:val="none"/>
+              </w:rPr>
+              <w:t>.</w:t>
+            </w:r>
+          </w:p>
+        </w:tc>
+        <w:tc>
+          <w:tcPr>
+            <w:tcW w:w="3589" w:type="dxa"/>
+            <w:tcBorders>
+              <w:top w:val="nil"/>
+              <w:left w:val="nil"/>
+              <w:bottom w:val="single" w:sz="8" w:space="0" w:color="E6E6E6"/>
+              <w:right w:val="single" w:sz="8" w:space="0" w:color="E6E6E6"/>
+            </w:tcBorders>
+            <w:shd w:val="clear" w:color="auto" w:fill="auto"/>
+            <w:vAlign w:val="center"/>
+            <w:hideMark/>
+          </w:tcPr>
+          <w:p>
+            <w:pPr>
+              <w:spacing w:after="0" w:line="240" w:lineRule="auto"/>
+              <w:rPr>
+                <w:rFonts w:ascii="Segoe UI" w:eastAsia="Times New Roman" w:hAnsi="Segoe UI" w:cs="Segoe UI"/>
+                <w:color w:val="000000"/>
+                <w:kern w:val="0"/>
+                <w:sz w:val="22"/>
+                <w:szCs w:val="22"/>
+                <w:lang w:eastAsia="en-CA"/>
+                <w14:ligatures w14:val="none"/>
+              </w:rPr>
+            </w:pPr>
+            <w:r>
+              <w:rPr>
+                <w:rFonts w:ascii="Segoe UI" w:eastAsia="Times New Roman" w:hAnsi="Segoe UI" w:cs="Segoe UI"/>
+                <w:color w:val="000000"/>
+                <w:kern w:val="0"/>
+                <w:sz w:val="22"/>
+                <w:szCs w:val="22"/>
+                <w:lang w:eastAsia="en-CA"/>
+                <w14:ligatures w14:val="none"/>
+              </w:rPr>
+              <w:t>Real</w:t>
+            </w:r>
+            <w:r>
+              <w:rPr>
+                <w:rFonts w:ascii="Segoe UI" w:eastAsia="Times New Roman" w:hAnsi="Segoe UI" w:cs="Segoe UI"/>
+                <w:color w:val="000000"/>
+                <w:kern w:val="0"/>
+                <w:sz w:val="22"/>
+                <w:szCs w:val="22"/>
+                <w:lang w:eastAsia="en-CA"/>
+                <w14:ligatures w14:val="none"/>
+              </w:rPr>
+              <w:noBreakHyphen/>
+              <w:t>time messaging was required to support timely coordination, negotiations, and clarification during dispatch and fulfillment processes.</w:t>
+            </w:r>
+          </w:p>
+        </w:tc>
+      </w:tr>
+    </w:tbl>
     <w:p/>
     <w:sectPr>
       <w:pgSz w:w="12240" w:h="15840"/>
@@ -988,6 +4124,381 @@
     </w:lvl>
   </w:abstractNum>
   <w:abstractNum w:abstractNumId="1" w15:restartNumberingAfterBreak="0">
+    <w:nsid w:val="082D66C5"/>
+    <w:multiLevelType w:val="hybridMultilevel"/>
+    <w:tmpl w:val="D5EECBAE"/>
+    <w:lvl w:ilvl="0" w:tplc="10090001">
+      <w:start w:val="1"/>
+      <w:numFmt w:val="bullet"/>
+      <w:lvlText w:val=""/>
+      <w:lvlJc w:val="left"/>
+      <w:pPr>
+        <w:ind w:left="1440" w:hanging="360"/>
+      </w:pPr>
+      <w:rPr>
+        <w:rFonts w:ascii="Symbol" w:hAnsi="Symbol" w:hint="default"/>
+      </w:rPr>
+    </w:lvl>
+    <w:lvl w:ilvl="1" w:tplc="10090003" w:tentative="1">
+      <w:start w:val="1"/>
+      <w:numFmt w:val="bullet"/>
+      <w:lvlText w:val="o"/>
+      <w:lvlJc w:val="left"/>
+      <w:pPr>
+        <w:ind w:left="2160" w:hanging="360"/>
+      </w:pPr>
+      <w:rPr>
+        <w:rFonts w:ascii="Courier New" w:hAnsi="Courier New" w:cs="Courier New" w:hint="default"/>
+      </w:rPr>
+    </w:lvl>
+    <w:lvl w:ilvl="2" w:tplc="10090005" w:tentative="1">
+      <w:start w:val="1"/>
+      <w:numFmt w:val="bullet"/>
+      <w:lvlText w:val=""/>
+      <w:lvlJc w:val="left"/>
+      <w:pPr>
+        <w:ind w:left="2880" w:hanging="360"/>
+      </w:pPr>
+      <w:rPr>
+        <w:rFonts w:ascii="Wingdings" w:hAnsi="Wingdings" w:hint="default"/>
+      </w:rPr>
+    </w:lvl>
+    <w:lvl w:ilvl="3" w:tplc="10090001" w:tentative="1">
+      <w:start w:val="1"/>
+      <w:numFmt w:val="bullet"/>
+      <w:lvlText w:val=""/>
+      <w:lvlJc w:val="left"/>
+      <w:pPr>
+        <w:ind w:left="3600" w:hanging="360"/>
+      </w:pPr>
+      <w:rPr>
+        <w:rFonts w:ascii="Symbol" w:hAnsi="Symbol" w:hint="default"/>
+      </w:rPr>
+    </w:lvl>
+    <w:lvl w:ilvl="4" w:tplc="10090003" w:tentative="1">
+      <w:start w:val="1"/>
+      <w:numFmt w:val="bullet"/>
+      <w:lvlText w:val="o"/>
+      <w:lvlJc w:val="left"/>
+      <w:pPr>
+        <w:ind w:left="4320" w:hanging="360"/>
+      </w:pPr>
+      <w:rPr>
+        <w:rFonts w:ascii="Courier New" w:hAnsi="Courier New" w:cs="Courier New" w:hint="default"/>
+      </w:rPr>
+    </w:lvl>
+    <w:lvl w:ilvl="5" w:tplc="10090005" w:tentative="1">
+      <w:start w:val="1"/>
+      <w:numFmt w:val="bullet"/>
+      <w:lvlText w:val=""/>
+      <w:lvlJc w:val="left"/>
+      <w:pPr>
+        <w:ind w:left="5040" w:hanging="360"/>
+      </w:pPr>
+      <w:rPr>
+        <w:rFonts w:ascii="Wingdings" w:hAnsi="Wingdings" w:hint="default"/>
+      </w:rPr>
+    </w:lvl>
+    <w:lvl w:ilvl="6" w:tplc="10090001" w:tentative="1">
+      <w:start w:val="1"/>
+      <w:numFmt w:val="bullet"/>
+      <w:lvlText w:val=""/>
+      <w:lvlJc w:val="left"/>
+      <w:pPr>
+        <w:ind w:left="5760" w:hanging="360"/>
+      </w:pPr>
+      <w:rPr>
+        <w:rFonts w:ascii="Symbol" w:hAnsi="Symbol" w:hint="default"/>
+      </w:rPr>
+    </w:lvl>
+    <w:lvl w:ilvl="7" w:tplc="10090003" w:tentative="1">
+      <w:start w:val="1"/>
+      <w:numFmt w:val="bullet"/>
+      <w:lvlText w:val="o"/>
+      <w:lvlJc w:val="left"/>
+      <w:pPr>
+        <w:ind w:left="6480" w:hanging="360"/>
+      </w:pPr>
+      <w:rPr>
+        <w:rFonts w:ascii="Courier New" w:hAnsi="Courier New" w:cs="Courier New" w:hint="default"/>
+      </w:rPr>
+    </w:lvl>
+    <w:lvl w:ilvl="8" w:tplc="10090005" w:tentative="1">
+      <w:start w:val="1"/>
+      <w:numFmt w:val="bullet"/>
+      <w:lvlText w:val=""/>
+      <w:lvlJc w:val="left"/>
+      <w:pPr>
+        <w:ind w:left="7200" w:hanging="360"/>
+      </w:pPr>
+      <w:rPr>
+        <w:rFonts w:ascii="Wingdings" w:hAnsi="Wingdings" w:hint="default"/>
+      </w:rPr>
+    </w:lvl>
+  </w:abstractNum>
+  <w:abstractNum w:abstractNumId="2" w15:restartNumberingAfterBreak="0">
+    <w:nsid w:val="0927507B"/>
+    <w:multiLevelType w:val="hybridMultilevel"/>
+    <w:tmpl w:val="A12E09F4"/>
+    <w:lvl w:ilvl="0" w:tplc="10090001">
+      <w:start w:val="1"/>
+      <w:numFmt w:val="bullet"/>
+      <w:lvlText w:val=""/>
+      <w:lvlJc w:val="left"/>
+      <w:pPr>
+        <w:ind w:left="360" w:hanging="360"/>
+      </w:pPr>
+      <w:rPr>
+        <w:rFonts w:ascii="Symbol" w:hAnsi="Symbol" w:hint="default"/>
+      </w:rPr>
+    </w:lvl>
+    <w:lvl w:ilvl="1" w:tplc="10090003" w:tentative="1">
+      <w:start w:val="1"/>
+      <w:numFmt w:val="bullet"/>
+      <w:lvlText w:val="o"/>
+      <w:lvlJc w:val="left"/>
+      <w:pPr>
+        <w:ind w:left="1080" w:hanging="360"/>
+      </w:pPr>
+      <w:rPr>
+        <w:rFonts w:ascii="Courier New" w:hAnsi="Courier New" w:cs="Courier New" w:hint="default"/>
+      </w:rPr>
+    </w:lvl>
+    <w:lvl w:ilvl="2" w:tplc="10090005" w:tentative="1">
+      <w:start w:val="1"/>
+      <w:numFmt w:val="bullet"/>
+      <w:lvlText w:val=""/>
+      <w:lvlJc w:val="left"/>
+      <w:pPr>
+        <w:ind w:left="1800" w:hanging="360"/>
+      </w:pPr>
+      <w:rPr>
+        <w:rFonts w:ascii="Wingdings" w:hAnsi="Wingdings" w:hint="default"/>
+      </w:rPr>
+    </w:lvl>
+    <w:lvl w:ilvl="3" w:tplc="10090001" w:tentative="1">
+      <w:start w:val="1"/>
+      <w:numFmt w:val="bullet"/>
+      <w:lvlText w:val=""/>
+      <w:lvlJc w:val="left"/>
+      <w:pPr>
+        <w:ind w:left="2520" w:hanging="360"/>
+      </w:pPr>
+      <w:rPr>
+        <w:rFonts w:ascii="Symbol" w:hAnsi="Symbol" w:hint="default"/>
+      </w:rPr>
+    </w:lvl>
+    <w:lvl w:ilvl="4" w:tplc="10090003" w:tentative="1">
+      <w:start w:val="1"/>
+      <w:numFmt w:val="bullet"/>
+      <w:lvlText w:val="o"/>
+      <w:lvlJc w:val="left"/>
+      <w:pPr>
+        <w:ind w:left="3240" w:hanging="360"/>
+      </w:pPr>
+      <w:rPr>
+        <w:rFonts w:ascii="Courier New" w:hAnsi="Courier New" w:cs="Courier New" w:hint="default"/>
+      </w:rPr>
+    </w:lvl>
+    <w:lvl w:ilvl="5" w:tplc="10090005" w:tentative="1">
+      <w:start w:val="1"/>
+      <w:numFmt w:val="bullet"/>
+      <w:lvlText w:val=""/>
+      <w:lvlJc w:val="left"/>
+      <w:pPr>
+        <w:ind w:left="3960" w:hanging="360"/>
+      </w:pPr>
+      <w:rPr>
+        <w:rFonts w:ascii="Wingdings" w:hAnsi="Wingdings" w:hint="default"/>
+      </w:rPr>
+    </w:lvl>
+    <w:lvl w:ilvl="6" w:tplc="10090001" w:tentative="1">
+      <w:start w:val="1"/>
+      <w:numFmt w:val="bullet"/>
+      <w:lvlText w:val=""/>
+      <w:lvlJc w:val="left"/>
+      <w:pPr>
+        <w:ind w:left="4680" w:hanging="360"/>
+      </w:pPr>
+      <w:rPr>
+        <w:rFonts w:ascii="Symbol" w:hAnsi="Symbol" w:hint="default"/>
+      </w:rPr>
+    </w:lvl>
+    <w:lvl w:ilvl="7" w:tplc="10090003" w:tentative="1">
+      <w:start w:val="1"/>
+      <w:numFmt w:val="bullet"/>
+      <w:lvlText w:val="o"/>
+      <w:lvlJc w:val="left"/>
+      <w:pPr>
+        <w:ind w:left="5400" w:hanging="360"/>
+      </w:pPr>
+      <w:rPr>
+        <w:rFonts w:ascii="Courier New" w:hAnsi="Courier New" w:cs="Courier New" w:hint="default"/>
+      </w:rPr>
+    </w:lvl>
+    <w:lvl w:ilvl="8" w:tplc="10090005" w:tentative="1">
+      <w:start w:val="1"/>
+      <w:numFmt w:val="bullet"/>
+      <w:lvlText w:val=""/>
+      <w:lvlJc w:val="left"/>
+      <w:pPr>
+        <w:ind w:left="6120" w:hanging="360"/>
+      </w:pPr>
+      <w:rPr>
+        <w:rFonts w:ascii="Wingdings" w:hAnsi="Wingdings" w:hint="default"/>
+      </w:rPr>
+    </w:lvl>
+  </w:abstractNum>
+  <w:abstractNum w:abstractNumId="3" w15:restartNumberingAfterBreak="0">
+    <w:nsid w:val="2A314874"/>
+    <w:multiLevelType w:val="multilevel"/>
+    <w:tmpl w:val="BA0E3BCE"/>
+    <w:lvl w:ilvl="0">
+      <w:start w:val="1"/>
+      <w:numFmt w:val="bullet"/>
+      <w:lvlText w:val=""/>
+      <w:lvlJc w:val="left"/>
+      <w:pPr>
+        <w:tabs>
+          <w:tab w:val="num" w:pos="720"/>
+        </w:tabs>
+        <w:ind w:left="720" w:hanging="360"/>
+      </w:pPr>
+      <w:rPr>
+        <w:rFonts w:ascii="Symbol" w:hAnsi="Symbol" w:hint="default"/>
+        <w:sz w:val="20"/>
+      </w:rPr>
+    </w:lvl>
+    <w:lvl w:ilvl="1" w:tentative="1">
+      <w:start w:val="1"/>
+      <w:numFmt w:val="bullet"/>
+      <w:lvlText w:val="o"/>
+      <w:lvlJc w:val="left"/>
+      <w:pPr>
+        <w:tabs>
+          <w:tab w:val="num" w:pos="1440"/>
+        </w:tabs>
+        <w:ind w:left="1440" w:hanging="360"/>
+      </w:pPr>
+      <w:rPr>
+        <w:rFonts w:ascii="Courier New" w:hAnsi="Courier New" w:hint="default"/>
+        <w:sz w:val="20"/>
+      </w:rPr>
+    </w:lvl>
+    <w:lvl w:ilvl="2" w:tentative="1">
+      <w:start w:val="1"/>
+      <w:numFmt w:val="bullet"/>
+      <w:lvlText w:val=""/>
+      <w:lvlJc w:val="left"/>
+      <w:pPr>
+        <w:tabs>
+          <w:tab w:val="num" w:pos="2160"/>
+        </w:tabs>
+        <w:ind w:left="2160" w:hanging="360"/>
+      </w:pPr>
+      <w:rPr>
+        <w:rFonts w:ascii="Wingdings" w:hAnsi="Wingdings" w:hint="default"/>
+        <w:sz w:val="20"/>
+      </w:rPr>
+    </w:lvl>
+    <w:lvl w:ilvl="3" w:tentative="1">
+      <w:start w:val="1"/>
+      <w:numFmt w:val="bullet"/>
+      <w:lvlText w:val=""/>
+      <w:lvlJc w:val="left"/>
+      <w:pPr>
+        <w:tabs>
+          <w:tab w:val="num" w:pos="2880"/>
+        </w:tabs>
+        <w:ind w:left="2880" w:hanging="360"/>
+      </w:pPr>
+      <w:rPr>
+        <w:rFonts w:ascii="Wingdings" w:hAnsi="Wingdings" w:hint="default"/>
+        <w:sz w:val="20"/>
+      </w:rPr>
+    </w:lvl>
+    <w:lvl w:ilvl="4" w:tentative="1">
+      <w:start w:val="1"/>
+      <w:numFmt w:val="bullet"/>
+      <w:lvlText w:val=""/>
+      <w:lvlJc w:val="left"/>
+      <w:pPr>
+        <w:tabs>
+          <w:tab w:val="num" w:pos="3600"/>
+        </w:tabs>
+        <w:ind w:left="3600" w:hanging="360"/>
+      </w:pPr>
+      <w:rPr>
+        <w:rFonts w:ascii="Wingdings" w:hAnsi="Wingdings" w:hint="default"/>
+        <w:sz w:val="20"/>
+      </w:rPr>
+    </w:lvl>
+    <w:lvl w:ilvl="5" w:tentative="1">
+      <w:start w:val="1"/>
+      <w:numFmt w:val="bullet"/>
+      <w:lvlText w:val=""/>
+      <w:lvlJc w:val="left"/>
+      <w:pPr>
+        <w:tabs>
+          <w:tab w:val="num" w:pos="4320"/>
+        </w:tabs>
+        <w:ind w:left="4320" w:hanging="360"/>
+      </w:pPr>
+      <w:rPr>
+        <w:rFonts w:ascii="Wingdings" w:hAnsi="Wingdings" w:hint="default"/>
+        <w:sz w:val="20"/>
+      </w:rPr>
+    </w:lvl>
+    <w:lvl w:ilvl="6" w:tentative="1">
+      <w:start w:val="1"/>
+      <w:numFmt w:val="bullet"/>
+      <w:lvlText w:val=""/>
+      <w:lvlJc w:val="left"/>
+      <w:pPr>
+        <w:tabs>
+          <w:tab w:val="num" w:pos="5040"/>
+        </w:tabs>
+        <w:ind w:left="5040" w:hanging="360"/>
+      </w:pPr>
+      <w:rPr>
+        <w:rFonts w:ascii="Wingdings" w:hAnsi="Wingdings" w:hint="default"/>
+        <w:sz w:val="20"/>
+      </w:rPr>
+    </w:lvl>
+    <w:lvl w:ilvl="7" w:tentative="1">
+      <w:start w:val="1"/>
+      <w:numFmt w:val="bullet"/>
+      <w:lvlText w:val=""/>
+      <w:lvlJc w:val="left"/>
+      <w:pPr>
+        <w:tabs>
+          <w:tab w:val="num" w:pos="5760"/>
+        </w:tabs>
+        <w:ind w:left="5760" w:hanging="360"/>
+      </w:pPr>
+      <w:rPr>
+        <w:rFonts w:ascii="Wingdings" w:hAnsi="Wingdings" w:hint="default"/>
+        <w:sz w:val="20"/>
+      </w:rPr>
+    </w:lvl>
+    <w:lvl w:ilvl="8" w:tentative="1">
+      <w:start w:val="1"/>
+      <w:numFmt w:val="bullet"/>
+      <w:lvlText w:val=""/>
+      <w:lvlJc w:val="left"/>
+      <w:pPr>
+        <w:tabs>
+          <w:tab w:val="num" w:pos="6480"/>
+        </w:tabs>
+        <w:ind w:left="6480" w:hanging="360"/>
+      </w:pPr>
+      <w:rPr>
+        <w:rFonts w:ascii="Wingdings" w:hAnsi="Wingdings" w:hint="default"/>
+        <w:sz w:val="20"/>
+      </w:rPr>
+    </w:lvl>
+  </w:abstractNum>
+  <w:abstractNum w:abstractNumId="4" w15:restartNumberingAfterBreak="0">
     <w:nsid w:val="2DC348C5"/>
     <w:multiLevelType w:val="multilevel"/>
     <w:tmpl w:val="FB6C0150"/>
@@ -1007,7 +4518,7 @@
         <w:sz w:val="20"/>
       </w:rPr>
     </w:lvl>
-    <w:lvl w:ilvl="1" w:tentative="1">
+    <w:lvl w:ilvl="1">
       <w:start w:val="1"/>
       <w:numFmt w:val="bullet"/>
       <w:lvlText w:val="o"/>
@@ -1136,7 +4647,7 @@
       </w:rPr>
     </w:lvl>
   </w:abstractNum>
-  <w:abstractNum w:abstractNumId="2" w15:restartNumberingAfterBreak="0">
+  <w:abstractNum w:abstractNumId="5" w15:restartNumberingAfterBreak="0">
     <w:nsid w:val="305859A9"/>
     <w:multiLevelType w:val="multilevel"/>
     <w:tmpl w:val="EFE02418"/>
@@ -1285,7 +4796,500 @@
       </w:rPr>
     </w:lvl>
   </w:abstractNum>
-  <w:abstractNum w:abstractNumId="3" w15:restartNumberingAfterBreak="0">
+  <w:abstractNum w:abstractNumId="6" w15:restartNumberingAfterBreak="0">
+    <w:nsid w:val="32995F24"/>
+    <w:multiLevelType w:val="multilevel"/>
+    <w:tmpl w:val="8C52B1B8"/>
+    <w:lvl w:ilvl="0">
+      <w:start w:val="1"/>
+      <w:numFmt w:val="decimal"/>
+      <w:lvlText w:val="%1."/>
+      <w:lvlJc w:val="left"/>
+      <w:pPr>
+        <w:ind w:left="720" w:hanging="360"/>
+      </w:pPr>
+    </w:lvl>
+    <w:lvl w:ilvl="1">
+      <w:start w:val="1"/>
+      <w:numFmt w:val="decimal"/>
+      <w:isLgl/>
+      <w:lvlText w:val="%1.%2"/>
+      <w:lvlJc w:val="left"/>
+      <w:pPr>
+        <w:ind w:left="840" w:hanging="480"/>
+      </w:pPr>
+      <w:rPr>
+        <w:rFonts w:hint="default"/>
+      </w:rPr>
+    </w:lvl>
+    <w:lvl w:ilvl="2">
+      <w:start w:val="1"/>
+      <w:numFmt w:val="decimal"/>
+      <w:isLgl/>
+      <w:lvlText w:val="%1.%2.%3"/>
+      <w:lvlJc w:val="left"/>
+      <w:pPr>
+        <w:ind w:left="1080" w:hanging="720"/>
+      </w:pPr>
+      <w:rPr>
+        <w:rFonts w:hint="default"/>
+      </w:rPr>
+    </w:lvl>
+    <w:lvl w:ilvl="3">
+      <w:start w:val="1"/>
+      <w:numFmt w:val="decimal"/>
+      <w:isLgl/>
+      <w:lvlText w:val="%1.%2.%3.%4"/>
+      <w:lvlJc w:val="left"/>
+      <w:pPr>
+        <w:ind w:left="1440" w:hanging="1080"/>
+      </w:pPr>
+      <w:rPr>
+        <w:rFonts w:hint="default"/>
+      </w:rPr>
+    </w:lvl>
+    <w:lvl w:ilvl="4">
+      <w:start w:val="1"/>
+      <w:numFmt w:val="decimal"/>
+      <w:isLgl/>
+      <w:lvlText w:val="%1.%2.%3.%4.%5"/>
+      <w:lvlJc w:val="left"/>
+      <w:pPr>
+        <w:ind w:left="1440" w:hanging="1080"/>
+      </w:pPr>
+      <w:rPr>
+        <w:rFonts w:hint="default"/>
+      </w:rPr>
+    </w:lvl>
+    <w:lvl w:ilvl="5">
+      <w:start w:val="1"/>
+      <w:numFmt w:val="decimal"/>
+      <w:isLgl/>
+      <w:lvlText w:val="%1.%2.%3.%4.%5.%6"/>
+      <w:lvlJc w:val="left"/>
+      <w:pPr>
+        <w:ind w:left="1800" w:hanging="1440"/>
+      </w:pPr>
+      <w:rPr>
+        <w:rFonts w:hint="default"/>
+      </w:rPr>
+    </w:lvl>
+    <w:lvl w:ilvl="6">
+      <w:start w:val="1"/>
+      <w:numFmt w:val="decimal"/>
+      <w:isLgl/>
+      <w:lvlText w:val="%1.%2.%3.%4.%5.%6.%7"/>
+      <w:lvlJc w:val="left"/>
+      <w:pPr>
+        <w:ind w:left="1800" w:hanging="1440"/>
+      </w:pPr>
+      <w:rPr>
+        <w:rFonts w:hint="default"/>
+      </w:rPr>
+    </w:lvl>
+    <w:lvl w:ilvl="7">
+      <w:start w:val="1"/>
+      <w:numFmt w:val="decimal"/>
+      <w:isLgl/>
+      <w:lvlText w:val="%1.%2.%3.%4.%5.%6.%7.%8"/>
+      <w:lvlJc w:val="left"/>
+      <w:pPr>
+        <w:ind w:left="2160" w:hanging="1800"/>
+      </w:pPr>
+      <w:rPr>
+        <w:rFonts w:hint="default"/>
+      </w:rPr>
+    </w:lvl>
+    <w:lvl w:ilvl="8">
+      <w:start w:val="1"/>
+      <w:numFmt w:val="decimal"/>
+      <w:isLgl/>
+      <w:lvlText w:val="%1.%2.%3.%4.%5.%6.%7.%8.%9"/>
+      <w:lvlJc w:val="left"/>
+      <w:pPr>
+        <w:ind w:left="2160" w:hanging="1800"/>
+      </w:pPr>
+      <w:rPr>
+        <w:rFonts w:hint="default"/>
+      </w:rPr>
+    </w:lvl>
+  </w:abstractNum>
+  <w:abstractNum w:abstractNumId="7" w15:restartNumberingAfterBreak="0">
+    <w:nsid w:val="39B92EB8"/>
+    <w:multiLevelType w:val="multilevel"/>
+    <w:tmpl w:val="9D5AEEF2"/>
+    <w:lvl w:ilvl="0">
+      <w:start w:val="1"/>
+      <w:numFmt w:val="bullet"/>
+      <w:lvlText w:val=""/>
+      <w:lvlJc w:val="left"/>
+      <w:pPr>
+        <w:tabs>
+          <w:tab w:val="num" w:pos="1080"/>
+        </w:tabs>
+        <w:ind w:left="1080" w:hanging="360"/>
+      </w:pPr>
+      <w:rPr>
+        <w:rFonts w:ascii="Symbol" w:hAnsi="Symbol" w:hint="default"/>
+        <w:sz w:val="20"/>
+      </w:rPr>
+    </w:lvl>
+    <w:lvl w:ilvl="1">
+      <w:start w:val="1"/>
+      <w:numFmt w:val="bullet"/>
+      <w:lvlText w:val="o"/>
+      <w:lvlJc w:val="left"/>
+      <w:pPr>
+        <w:tabs>
+          <w:tab w:val="num" w:pos="1800"/>
+        </w:tabs>
+        <w:ind w:left="1800" w:hanging="360"/>
+      </w:pPr>
+      <w:rPr>
+        <w:rFonts w:ascii="Courier New" w:hAnsi="Courier New" w:hint="default"/>
+        <w:sz w:val="20"/>
+      </w:rPr>
+    </w:lvl>
+    <w:lvl w:ilvl="2" w:tentative="1">
+      <w:start w:val="1"/>
+      <w:numFmt w:val="bullet"/>
+      <w:lvlText w:val=""/>
+      <w:lvlJc w:val="left"/>
+      <w:pPr>
+        <w:tabs>
+          <w:tab w:val="num" w:pos="2520"/>
+        </w:tabs>
+        <w:ind w:left="2520" w:hanging="360"/>
+      </w:pPr>
+      <w:rPr>
+        <w:rFonts w:ascii="Wingdings" w:hAnsi="Wingdings" w:hint="default"/>
+        <w:sz w:val="20"/>
+      </w:rPr>
+    </w:lvl>
+    <w:lvl w:ilvl="3" w:tentative="1">
+      <w:start w:val="1"/>
+      <w:numFmt w:val="bullet"/>
+      <w:lvlText w:val=""/>
+      <w:lvlJc w:val="left"/>
+      <w:pPr>
+        <w:tabs>
+          <w:tab w:val="num" w:pos="3240"/>
+        </w:tabs>
+        <w:ind w:left="3240" w:hanging="360"/>
+      </w:pPr>
+      <w:rPr>
+        <w:rFonts w:ascii="Wingdings" w:hAnsi="Wingdings" w:hint="default"/>
+        <w:sz w:val="20"/>
+      </w:rPr>
+    </w:lvl>
+    <w:lvl w:ilvl="4" w:tentative="1">
+      <w:start w:val="1"/>
+      <w:numFmt w:val="bullet"/>
+      <w:lvlText w:val=""/>
+      <w:lvlJc w:val="left"/>
+      <w:pPr>
+        <w:tabs>
+          <w:tab w:val="num" w:pos="3960"/>
+        </w:tabs>
+        <w:ind w:left="3960" w:hanging="360"/>
+      </w:pPr>
+      <w:rPr>
+        <w:rFonts w:ascii="Wingdings" w:hAnsi="Wingdings" w:hint="default"/>
+        <w:sz w:val="20"/>
+      </w:rPr>
+    </w:lvl>
+    <w:lvl w:ilvl="5" w:tentative="1">
+      <w:start w:val="1"/>
+      <w:numFmt w:val="bullet"/>
+      <w:lvlText w:val=""/>
+      <w:lvlJc w:val="left"/>
+      <w:pPr>
+        <w:tabs>
+          <w:tab w:val="num" w:pos="4680"/>
+        </w:tabs>
+        <w:ind w:left="4680" w:hanging="360"/>
+      </w:pPr>
+      <w:rPr>
+        <w:rFonts w:ascii="Wingdings" w:hAnsi="Wingdings" w:hint="default"/>
+        <w:sz w:val="20"/>
+      </w:rPr>
+    </w:lvl>
+    <w:lvl w:ilvl="6" w:tentative="1">
+      <w:start w:val="1"/>
+      <w:numFmt w:val="bullet"/>
+      <w:lvlText w:val=""/>
+      <w:lvlJc w:val="left"/>
+      <w:pPr>
+        <w:tabs>
+          <w:tab w:val="num" w:pos="5400"/>
+        </w:tabs>
+        <w:ind w:left="5400" w:hanging="360"/>
+      </w:pPr>
+      <w:rPr>
+        <w:rFonts w:ascii="Wingdings" w:hAnsi="Wingdings" w:hint="default"/>
+        <w:sz w:val="20"/>
+      </w:rPr>
+    </w:lvl>
+    <w:lvl w:ilvl="7" w:tentative="1">
+      <w:start w:val="1"/>
+      <w:numFmt w:val="bullet"/>
+      <w:lvlText w:val=""/>
+      <w:lvlJc w:val="left"/>
+      <w:pPr>
+        <w:tabs>
+          <w:tab w:val="num" w:pos="6120"/>
+        </w:tabs>
+        <w:ind w:left="6120" w:hanging="360"/>
+      </w:pPr>
+      <w:rPr>
+        <w:rFonts w:ascii="Wingdings" w:hAnsi="Wingdings" w:hint="default"/>
+        <w:sz w:val="20"/>
+      </w:rPr>
+    </w:lvl>
+    <w:lvl w:ilvl="8" w:tentative="1">
+      <w:start w:val="1"/>
+      <w:numFmt w:val="bullet"/>
+      <w:lvlText w:val=""/>
+      <w:lvlJc w:val="left"/>
+      <w:pPr>
+        <w:tabs>
+          <w:tab w:val="num" w:pos="6840"/>
+        </w:tabs>
+        <w:ind w:left="6840" w:hanging="360"/>
+      </w:pPr>
+      <w:rPr>
+        <w:rFonts w:ascii="Wingdings" w:hAnsi="Wingdings" w:hint="default"/>
+        <w:sz w:val="20"/>
+      </w:rPr>
+    </w:lvl>
+  </w:abstractNum>
+  <w:abstractNum w:abstractNumId="8" w15:restartNumberingAfterBreak="0">
+    <w:nsid w:val="3FF849D6"/>
+    <w:multiLevelType w:val="hybridMultilevel"/>
+    <w:tmpl w:val="B3567F06"/>
+    <w:lvl w:ilvl="0" w:tplc="10090001">
+      <w:start w:val="1"/>
+      <w:numFmt w:val="bullet"/>
+      <w:lvlText w:val=""/>
+      <w:lvlJc w:val="left"/>
+      <w:pPr>
+        <w:ind w:left="360" w:hanging="360"/>
+      </w:pPr>
+      <w:rPr>
+        <w:rFonts w:ascii="Symbol" w:hAnsi="Symbol" w:hint="default"/>
+      </w:rPr>
+    </w:lvl>
+    <w:lvl w:ilvl="1" w:tplc="10090003" w:tentative="1">
+      <w:start w:val="1"/>
+      <w:numFmt w:val="bullet"/>
+      <w:lvlText w:val="o"/>
+      <w:lvlJc w:val="left"/>
+      <w:pPr>
+        <w:ind w:left="1080" w:hanging="360"/>
+      </w:pPr>
+      <w:rPr>
+        <w:rFonts w:ascii="Courier New" w:hAnsi="Courier New" w:cs="Courier New" w:hint="default"/>
+      </w:rPr>
+    </w:lvl>
+    <w:lvl w:ilvl="2" w:tplc="10090005" w:tentative="1">
+      <w:start w:val="1"/>
+      <w:numFmt w:val="bullet"/>
+      <w:lvlText w:val=""/>
+      <w:lvlJc w:val="left"/>
+      <w:pPr>
+        <w:ind w:left="1800" w:hanging="360"/>
+      </w:pPr>
+      <w:rPr>
+        <w:rFonts w:ascii="Wingdings" w:hAnsi="Wingdings" w:hint="default"/>
+      </w:rPr>
+    </w:lvl>
+    <w:lvl w:ilvl="3" w:tplc="10090001" w:tentative="1">
+      <w:start w:val="1"/>
+      <w:numFmt w:val="bullet"/>
+      <w:lvlText w:val=""/>
+      <w:lvlJc w:val="left"/>
+      <w:pPr>
+        <w:ind w:left="2520" w:hanging="360"/>
+      </w:pPr>
+      <w:rPr>
+        <w:rFonts w:ascii="Symbol" w:hAnsi="Symbol" w:hint="default"/>
+      </w:rPr>
+    </w:lvl>
+    <w:lvl w:ilvl="4" w:tplc="10090003" w:tentative="1">
+      <w:start w:val="1"/>
+      <w:numFmt w:val="bullet"/>
+      <w:lvlText w:val="o"/>
+      <w:lvlJc w:val="left"/>
+      <w:pPr>
+        <w:ind w:left="3240" w:hanging="360"/>
+      </w:pPr>
+      <w:rPr>
+        <w:rFonts w:ascii="Courier New" w:hAnsi="Courier New" w:cs="Courier New" w:hint="default"/>
+      </w:rPr>
+    </w:lvl>
+    <w:lvl w:ilvl="5" w:tplc="10090005" w:tentative="1">
+      <w:start w:val="1"/>
+      <w:numFmt w:val="bullet"/>
+      <w:lvlText w:val=""/>
+      <w:lvlJc w:val="left"/>
+      <w:pPr>
+        <w:ind w:left="3960" w:hanging="360"/>
+      </w:pPr>
+      <w:rPr>
+        <w:rFonts w:ascii="Wingdings" w:hAnsi="Wingdings" w:hint="default"/>
+      </w:rPr>
+    </w:lvl>
+    <w:lvl w:ilvl="6" w:tplc="10090001" w:tentative="1">
+      <w:start w:val="1"/>
+      <w:numFmt w:val="bullet"/>
+      <w:lvlText w:val=""/>
+      <w:lvlJc w:val="left"/>
+      <w:pPr>
+        <w:ind w:left="4680" w:hanging="360"/>
+      </w:pPr>
+      <w:rPr>
+        <w:rFonts w:ascii="Symbol" w:hAnsi="Symbol" w:hint="default"/>
+      </w:rPr>
+    </w:lvl>
+    <w:lvl w:ilvl="7" w:tplc="10090003" w:tentative="1">
+      <w:start w:val="1"/>
+      <w:numFmt w:val="bullet"/>
+      <w:lvlText w:val="o"/>
+      <w:lvlJc w:val="left"/>
+      <w:pPr>
+        <w:ind w:left="5400" w:hanging="360"/>
+      </w:pPr>
+      <w:rPr>
+        <w:rFonts w:ascii="Courier New" w:hAnsi="Courier New" w:cs="Courier New" w:hint="default"/>
+      </w:rPr>
+    </w:lvl>
+    <w:lvl w:ilvl="8" w:tplc="10090005" w:tentative="1">
+      <w:start w:val="1"/>
+      <w:numFmt w:val="bullet"/>
+      <w:lvlText w:val=""/>
+      <w:lvlJc w:val="left"/>
+      <w:pPr>
+        <w:ind w:left="6120" w:hanging="360"/>
+      </w:pPr>
+      <w:rPr>
+        <w:rFonts w:ascii="Wingdings" w:hAnsi="Wingdings" w:hint="default"/>
+      </w:rPr>
+    </w:lvl>
+  </w:abstractNum>
+  <w:abstractNum w:abstractNumId="9" w15:restartNumberingAfterBreak="0">
+    <w:nsid w:val="43A8490D"/>
+    <w:multiLevelType w:val="hybridMultilevel"/>
+    <w:tmpl w:val="6178A22E"/>
+    <w:lvl w:ilvl="0" w:tplc="10090001">
+      <w:start w:val="1"/>
+      <w:numFmt w:val="bullet"/>
+      <w:lvlText w:val=""/>
+      <w:lvlJc w:val="left"/>
+      <w:pPr>
+        <w:ind w:left="1440" w:hanging="360"/>
+      </w:pPr>
+      <w:rPr>
+        <w:rFonts w:ascii="Symbol" w:hAnsi="Symbol" w:hint="default"/>
+      </w:rPr>
+    </w:lvl>
+    <w:lvl w:ilvl="1" w:tplc="10090003" w:tentative="1">
+      <w:start w:val="1"/>
+      <w:numFmt w:val="bullet"/>
+      <w:lvlText w:val="o"/>
+      <w:lvlJc w:val="left"/>
+      <w:pPr>
+        <w:ind w:left="2160" w:hanging="360"/>
+      </w:pPr>
+      <w:rPr>
+        <w:rFonts w:ascii="Courier New" w:hAnsi="Courier New" w:cs="Courier New" w:hint="default"/>
+      </w:rPr>
+    </w:lvl>
+    <w:lvl w:ilvl="2" w:tplc="10090005" w:tentative="1">
+      <w:start w:val="1"/>
+      <w:numFmt w:val="bullet"/>
+      <w:lvlText w:val=""/>
+      <w:lvlJc w:val="left"/>
+      <w:pPr>
+        <w:ind w:left="2880" w:hanging="360"/>
+      </w:pPr>
+      <w:rPr>
+        <w:rFonts w:ascii="Wingdings" w:hAnsi="Wingdings" w:hint="default"/>
+      </w:rPr>
+    </w:lvl>
+    <w:lvl w:ilvl="3" w:tplc="10090001" w:tentative="1">
+      <w:start w:val="1"/>
+      <w:numFmt w:val="bullet"/>
+      <w:lvlText w:val=""/>
+      <w:lvlJc w:val="left"/>
+      <w:pPr>
+        <w:ind w:left="3600" w:hanging="360"/>
+      </w:pPr>
+      <w:rPr>
+        <w:rFonts w:ascii="Symbol" w:hAnsi="Symbol" w:hint="default"/>
+      </w:rPr>
+    </w:lvl>
+    <w:lvl w:ilvl="4" w:tplc="10090003" w:tentative="1">
+      <w:start w:val="1"/>
+      <w:numFmt w:val="bullet"/>
+      <w:lvlText w:val="o"/>
+      <w:lvlJc w:val="left"/>
+      <w:pPr>
+        <w:ind w:left="4320" w:hanging="360"/>
+      </w:pPr>
+      <w:rPr>
+        <w:rFonts w:ascii="Courier New" w:hAnsi="Courier New" w:cs="Courier New" w:hint="default"/>
+      </w:rPr>
+    </w:lvl>
+    <w:lvl w:ilvl="5" w:tplc="10090005" w:tentative="1">
+      <w:start w:val="1"/>
+      <w:numFmt w:val="bullet"/>
+      <w:lvlText w:val=""/>
+      <w:lvlJc w:val="left"/>
+      <w:pPr>
+        <w:ind w:left="5040" w:hanging="360"/>
+      </w:pPr>
+      <w:rPr>
+        <w:rFonts w:ascii="Wingdings" w:hAnsi="Wingdings" w:hint="default"/>
+      </w:rPr>
+    </w:lvl>
+    <w:lvl w:ilvl="6" w:tplc="10090001" w:tentative="1">
+      <w:start w:val="1"/>
+      <w:numFmt w:val="bullet"/>
+      <w:lvlText w:val=""/>
+      <w:lvlJc w:val="left"/>
+      <w:pPr>
+        <w:ind w:left="5760" w:hanging="360"/>
+      </w:pPr>
+      <w:rPr>
+        <w:rFonts w:ascii="Symbol" w:hAnsi="Symbol" w:hint="default"/>
+      </w:rPr>
+    </w:lvl>
+    <w:lvl w:ilvl="7" w:tplc="10090003" w:tentative="1">
+      <w:start w:val="1"/>
+      <w:numFmt w:val="bullet"/>
+      <w:lvlText w:val="o"/>
+      <w:lvlJc w:val="left"/>
+      <w:pPr>
+        <w:ind w:left="6480" w:hanging="360"/>
+      </w:pPr>
+      <w:rPr>
+        <w:rFonts w:ascii="Courier New" w:hAnsi="Courier New" w:cs="Courier New" w:hint="default"/>
+      </w:rPr>
+    </w:lvl>
+    <w:lvl w:ilvl="8" w:tplc="10090005" w:tentative="1">
+      <w:start w:val="1"/>
+      <w:numFmt w:val="bullet"/>
+      <w:lvlText w:val=""/>
+      <w:lvlJc w:val="left"/>
+      <w:pPr>
+        <w:ind w:left="7200" w:hanging="360"/>
+      </w:pPr>
+      <w:rPr>
+        <w:rFonts w:ascii="Wingdings" w:hAnsi="Wingdings" w:hint="default"/>
+      </w:rPr>
+    </w:lvl>
+  </w:abstractNum>
+  <w:abstractNum w:abstractNumId="10" w15:restartNumberingAfterBreak="0">
     <w:nsid w:val="44B80683"/>
     <w:multiLevelType w:val="multilevel"/>
     <w:tmpl w:val="1D30FB4A"/>
@@ -1434,7 +5438,233 @@
       </w:rPr>
     </w:lvl>
   </w:abstractNum>
-  <w:abstractNum w:abstractNumId="4" w15:restartNumberingAfterBreak="0">
+  <w:abstractNum w:abstractNumId="11" w15:restartNumberingAfterBreak="0">
+    <w:nsid w:val="5411559E"/>
+    <w:multiLevelType w:val="hybridMultilevel"/>
+    <w:tmpl w:val="A724A382"/>
+    <w:lvl w:ilvl="0" w:tplc="10090001">
+      <w:start w:val="1"/>
+      <w:numFmt w:val="bullet"/>
+      <w:lvlText w:val=""/>
+      <w:lvlJc w:val="left"/>
+      <w:pPr>
+        <w:ind w:left="1080" w:hanging="360"/>
+      </w:pPr>
+      <w:rPr>
+        <w:rFonts w:ascii="Symbol" w:hAnsi="Symbol" w:hint="default"/>
+      </w:rPr>
+    </w:lvl>
+    <w:lvl w:ilvl="1" w:tplc="10090003" w:tentative="1">
+      <w:start w:val="1"/>
+      <w:numFmt w:val="bullet"/>
+      <w:lvlText w:val="o"/>
+      <w:lvlJc w:val="left"/>
+      <w:pPr>
+        <w:ind w:left="1800" w:hanging="360"/>
+      </w:pPr>
+      <w:rPr>
+        <w:rFonts w:ascii="Courier New" w:hAnsi="Courier New" w:cs="Courier New" w:hint="default"/>
+      </w:rPr>
+    </w:lvl>
+    <w:lvl w:ilvl="2" w:tplc="10090005" w:tentative="1">
+      <w:start w:val="1"/>
+      <w:numFmt w:val="bullet"/>
+      <w:lvlText w:val=""/>
+      <w:lvlJc w:val="left"/>
+      <w:pPr>
+        <w:ind w:left="2520" w:hanging="360"/>
+      </w:pPr>
+      <w:rPr>
+        <w:rFonts w:ascii="Wingdings" w:hAnsi="Wingdings" w:hint="default"/>
+      </w:rPr>
+    </w:lvl>
+    <w:lvl w:ilvl="3" w:tplc="10090001" w:tentative="1">
+      <w:start w:val="1"/>
+      <w:numFmt w:val="bullet"/>
+      <w:lvlText w:val=""/>
+      <w:lvlJc w:val="left"/>
+      <w:pPr>
+        <w:ind w:left="3240" w:hanging="360"/>
+      </w:pPr>
+      <w:rPr>
+        <w:rFonts w:ascii="Symbol" w:hAnsi="Symbol" w:hint="default"/>
+      </w:rPr>
+    </w:lvl>
+    <w:lvl w:ilvl="4" w:tplc="10090003" w:tentative="1">
+      <w:start w:val="1"/>
+      <w:numFmt w:val="bullet"/>
+      <w:lvlText w:val="o"/>
+      <w:lvlJc w:val="left"/>
+      <w:pPr>
+        <w:ind w:left="3960" w:hanging="360"/>
+      </w:pPr>
+      <w:rPr>
+        <w:rFonts w:ascii="Courier New" w:hAnsi="Courier New" w:cs="Courier New" w:hint="default"/>
+      </w:rPr>
+    </w:lvl>
+    <w:lvl w:ilvl="5" w:tplc="10090005" w:tentative="1">
+      <w:start w:val="1"/>
+      <w:numFmt w:val="bullet"/>
+      <w:lvlText w:val=""/>
+      <w:lvlJc w:val="left"/>
+      <w:pPr>
+        <w:ind w:left="4680" w:hanging="360"/>
+      </w:pPr>
+      <w:rPr>
+        <w:rFonts w:ascii="Wingdings" w:hAnsi="Wingdings" w:hint="default"/>
+      </w:rPr>
+    </w:lvl>
+    <w:lvl w:ilvl="6" w:tplc="10090001" w:tentative="1">
+      <w:start w:val="1"/>
+      <w:numFmt w:val="bullet"/>
+      <w:lvlText w:val=""/>
+      <w:lvlJc w:val="left"/>
+      <w:pPr>
+        <w:ind w:left="5400" w:hanging="360"/>
+      </w:pPr>
+      <w:rPr>
+        <w:rFonts w:ascii="Symbol" w:hAnsi="Symbol" w:hint="default"/>
+      </w:rPr>
+    </w:lvl>
+    <w:lvl w:ilvl="7" w:tplc="10090003" w:tentative="1">
+      <w:start w:val="1"/>
+      <w:numFmt w:val="bullet"/>
+      <w:lvlText w:val="o"/>
+      <w:lvlJc w:val="left"/>
+      <w:pPr>
+        <w:ind w:left="6120" w:hanging="360"/>
+      </w:pPr>
+      <w:rPr>
+        <w:rFonts w:ascii="Courier New" w:hAnsi="Courier New" w:cs="Courier New" w:hint="default"/>
+      </w:rPr>
+    </w:lvl>
+    <w:lvl w:ilvl="8" w:tplc="10090005" w:tentative="1">
+      <w:start w:val="1"/>
+      <w:numFmt w:val="bullet"/>
+      <w:lvlText w:val=""/>
+      <w:lvlJc w:val="left"/>
+      <w:pPr>
+        <w:ind w:left="6840" w:hanging="360"/>
+      </w:pPr>
+      <w:rPr>
+        <w:rFonts w:ascii="Wingdings" w:hAnsi="Wingdings" w:hint="default"/>
+      </w:rPr>
+    </w:lvl>
+  </w:abstractNum>
+  <w:abstractNum w:abstractNumId="12" w15:restartNumberingAfterBreak="0">
+    <w:nsid w:val="6233041C"/>
+    <w:multiLevelType w:val="hybridMultilevel"/>
+    <w:tmpl w:val="8D2C65CA"/>
+    <w:lvl w:ilvl="0" w:tplc="10090001">
+      <w:start w:val="1"/>
+      <w:numFmt w:val="bullet"/>
+      <w:lvlText w:val=""/>
+      <w:lvlJc w:val="left"/>
+      <w:pPr>
+        <w:ind w:left="1080" w:hanging="360"/>
+      </w:pPr>
+      <w:rPr>
+        <w:rFonts w:ascii="Symbol" w:hAnsi="Symbol" w:hint="default"/>
+      </w:rPr>
+    </w:lvl>
+    <w:lvl w:ilvl="1" w:tplc="10090003" w:tentative="1">
+      <w:start w:val="1"/>
+      <w:numFmt w:val="bullet"/>
+      <w:lvlText w:val="o"/>
+      <w:lvlJc w:val="left"/>
+      <w:pPr>
+        <w:ind w:left="1800" w:hanging="360"/>
+      </w:pPr>
+      <w:rPr>
+        <w:rFonts w:ascii="Courier New" w:hAnsi="Courier New" w:cs="Courier New" w:hint="default"/>
+      </w:rPr>
+    </w:lvl>
+    <w:lvl w:ilvl="2" w:tplc="10090005" w:tentative="1">
+      <w:start w:val="1"/>
+      <w:numFmt w:val="bullet"/>
+      <w:lvlText w:val=""/>
+      <w:lvlJc w:val="left"/>
+      <w:pPr>
+        <w:ind w:left="2520" w:hanging="360"/>
+      </w:pPr>
+      <w:rPr>
+        <w:rFonts w:ascii="Wingdings" w:hAnsi="Wingdings" w:hint="default"/>
+      </w:rPr>
+    </w:lvl>
+    <w:lvl w:ilvl="3" w:tplc="10090001" w:tentative="1">
+      <w:start w:val="1"/>
+      <w:numFmt w:val="bullet"/>
+      <w:lvlText w:val=""/>
+      <w:lvlJc w:val="left"/>
+      <w:pPr>
+        <w:ind w:left="3240" w:hanging="360"/>
+      </w:pPr>
+      <w:rPr>
+        <w:rFonts w:ascii="Symbol" w:hAnsi="Symbol" w:hint="default"/>
+      </w:rPr>
+    </w:lvl>
+    <w:lvl w:ilvl="4" w:tplc="10090003" w:tentative="1">
+      <w:start w:val="1"/>
+      <w:numFmt w:val="bullet"/>
+      <w:lvlText w:val="o"/>
+      <w:lvlJc w:val="left"/>
+      <w:pPr>
+        <w:ind w:left="3960" w:hanging="360"/>
+      </w:pPr>
+      <w:rPr>
+        <w:rFonts w:ascii="Courier New" w:hAnsi="Courier New" w:cs="Courier New" w:hint="default"/>
+      </w:rPr>
+    </w:lvl>
+    <w:lvl w:ilvl="5" w:tplc="10090005" w:tentative="1">
+      <w:start w:val="1"/>
+      <w:numFmt w:val="bullet"/>
+      <w:lvlText w:val=""/>
+      <w:lvlJc w:val="left"/>
+      <w:pPr>
+        <w:ind w:left="4680" w:hanging="360"/>
+      </w:pPr>
+      <w:rPr>
+        <w:rFonts w:ascii="Wingdings" w:hAnsi="Wingdings" w:hint="default"/>
+      </w:rPr>
+    </w:lvl>
+    <w:lvl w:ilvl="6" w:tplc="10090001" w:tentative="1">
+      <w:start w:val="1"/>
+      <w:numFmt w:val="bullet"/>
+      <w:lvlText w:val=""/>
+      <w:lvlJc w:val="left"/>
+      <w:pPr>
+        <w:ind w:left="5400" w:hanging="360"/>
+      </w:pPr>
+      <w:rPr>
+        <w:rFonts w:ascii="Symbol" w:hAnsi="Symbol" w:hint="default"/>
+      </w:rPr>
+    </w:lvl>
+    <w:lvl w:ilvl="7" w:tplc="10090003" w:tentative="1">
+      <w:start w:val="1"/>
+      <w:numFmt w:val="bullet"/>
+      <w:lvlText w:val="o"/>
+      <w:lvlJc w:val="left"/>
+      <w:pPr>
+        <w:ind w:left="6120" w:hanging="360"/>
+      </w:pPr>
+      <w:rPr>
+        <w:rFonts w:ascii="Courier New" w:hAnsi="Courier New" w:cs="Courier New" w:hint="default"/>
+      </w:rPr>
+    </w:lvl>
+    <w:lvl w:ilvl="8" w:tplc="10090005" w:tentative="1">
+      <w:start w:val="1"/>
+      <w:numFmt w:val="bullet"/>
+      <w:lvlText w:val=""/>
+      <w:lvlJc w:val="left"/>
+      <w:pPr>
+        <w:ind w:left="6840" w:hanging="360"/>
+      </w:pPr>
+      <w:rPr>
+        <w:rFonts w:ascii="Wingdings" w:hAnsi="Wingdings" w:hint="default"/>
+      </w:rPr>
+    </w:lvl>
+  </w:abstractNum>
+  <w:abstractNum w:abstractNumId="13" w15:restartNumberingAfterBreak="0">
     <w:nsid w:val="70250433"/>
     <w:multiLevelType w:val="multilevel"/>
     <w:tmpl w:val="98267758"/>
@@ -1584,19 +5814,46 @@
     </w:lvl>
   </w:abstractNum>
   <w:num w:numId="1" w16cid:durableId="1722244434">
-    <w:abstractNumId w:val="3"/>
+    <w:abstractNumId w:val="10"/>
   </w:num>
   <w:num w:numId="2" w16cid:durableId="1327124678">
-    <w:abstractNumId w:val="1"/>
+    <w:abstractNumId w:val="4"/>
   </w:num>
   <w:num w:numId="3" w16cid:durableId="179129693">
     <w:abstractNumId w:val="0"/>
   </w:num>
   <w:num w:numId="4" w16cid:durableId="55783816">
+    <w:abstractNumId w:val="5"/>
+  </w:num>
+  <w:num w:numId="5" w16cid:durableId="1949118223">
+    <w:abstractNumId w:val="13"/>
+  </w:num>
+  <w:num w:numId="6" w16cid:durableId="702362771">
+    <w:abstractNumId w:val="6"/>
+  </w:num>
+  <w:num w:numId="7" w16cid:durableId="960067666">
+    <w:abstractNumId w:val="9"/>
+  </w:num>
+  <w:num w:numId="8" w16cid:durableId="640187390">
+    <w:abstractNumId w:val="1"/>
+  </w:num>
+  <w:num w:numId="9" w16cid:durableId="1103577767">
+    <w:abstractNumId w:val="11"/>
+  </w:num>
+  <w:num w:numId="10" w16cid:durableId="1195340797">
     <w:abstractNumId w:val="2"/>
   </w:num>
-  <w:num w:numId="5" w16cid:durableId="1949118223">
-    <w:abstractNumId w:val="4"/>
+  <w:num w:numId="11" w16cid:durableId="1925067143">
+    <w:abstractNumId w:val="8"/>
+  </w:num>
+  <w:num w:numId="12" w16cid:durableId="253977761">
+    <w:abstractNumId w:val="7"/>
+  </w:num>
+  <w:num w:numId="13" w16cid:durableId="25525118">
+    <w:abstractNumId w:val="12"/>
+  </w:num>
+  <w:num w:numId="14" w16cid:durableId="1394618382">
+    <w:abstractNumId w:val="3"/>
   </w:num>
 </w:numbering>
 </file>
@@ -2029,7 +6286,6 @@
     <w:next w:val="Normal"/>
     <w:link w:val="Heading2Char"/>
     <w:uiPriority w:val="9"/>
-    <w:semiHidden/>
     <w:unhideWhenUsed/>
     <w:qFormat/>
     <w:rsid w:val="00CA7C10"/>
@@ -2204,7 +6460,6 @@
   <w:style w:type="character" w:default="1" w:styleId="DefaultParagraphFont">
     <w:name w:val="Default Paragraph Font"/>
     <w:uiPriority w:val="1"/>
-    <w:semiHidden/>
     <w:unhideWhenUsed/>
   </w:style>
   <w:style w:type="table" w:default="1" w:styleId="TableNormal">
@@ -2246,7 +6501,6 @@
     <w:basedOn w:val="DefaultParagraphFont"/>
     <w:link w:val="Heading2"/>
     <w:uiPriority w:val="9"/>
-    <w:semiHidden/>
     <w:rsid w:val="00CA7C10"/>
     <w:rPr>
       <w:rFonts w:asciiTheme="majorHAnsi" w:eastAsiaTheme="majorEastAsia" w:hAnsiTheme="majorHAnsi" w:cstheme="majorBidi"/>
@@ -2516,6 +6770,34 @@
       <w:smallCaps/>
       <w:color w:val="0F4761" w:themeColor="accent1" w:themeShade="BF"/>
       <w:spacing w:val="5"/>
+    </w:rPr>
+  </w:style>
+  <w:style w:type="paragraph" w:styleId="NormalWeb">
+    <w:name w:val="Normal (Web)"/>
+    <w:basedOn w:val="Normal"/>
+    <w:uiPriority w:val="99"/>
+    <w:semiHidden/>
+    <w:unhideWhenUsed/>
+    <w:rsid w:val="00E5084D"/>
+    <w:pPr>
+      <w:spacing w:before="100" w:beforeAutospacing="1" w:after="100" w:afterAutospacing="1" w:line="240" w:lineRule="auto"/>
+    </w:pPr>
+    <w:rPr>
+      <w:rFonts w:ascii="Times New Roman" w:eastAsia="Times New Roman" w:hAnsi="Times New Roman" w:cs="Times New Roman"/>
+      <w:kern w:val="0"/>
+      <w:lang w:eastAsia="en-CA"/>
+      <w14:ligatures w14:val="none"/>
+    </w:rPr>
+  </w:style>
+  <w:style w:type="character" w:styleId="Strong">
+    <w:name w:val="Strong"/>
+    <w:basedOn w:val="DefaultParagraphFont"/>
+    <w:uiPriority w:val="22"/>
+    <w:qFormat/>
+    <w:rsid w:val="00E5084D"/>
+    <w:rPr>
+      <w:b/>
+      <w:bCs/>
     </w:rPr>
   </w:style>
 </w:styles>

</xml_diff>